<commit_message>
Sua Task 8 mob-header khop demo: 1 nut chuong, brand lien, sub dung chu
</commit_message>
<xml_diff>
--- a/docs/BTC - PHIEU DANG KY DU THI 2026-CAOPHUCTHINH.docx
+++ b/docs/BTC - PHIEU DANG KY DU THI 2026-CAOPHUCTHINH.docx
@@ -834,7 +834,23 @@
           <w:szCs w:val="28"/>
         </w:rPr>
         <w:tab/>
-        <w:t xml:space="preserve">- Trình </w:t>
+        <w:t xml:space="preserve">- </w:t>
+      </w:r>
+      <w:proofErr w:type="spellStart"/>
+      <w:r>
+        <w:rPr>
+          <w:sz w:val="28"/>
+          <w:szCs w:val="28"/>
+        </w:rPr>
+        <w:t>Trình</w:t>
+      </w:r>
+      <w:proofErr w:type="spellEnd"/>
+      <w:r>
+        <w:rPr>
+          <w:sz w:val="28"/>
+          <w:szCs w:val="28"/>
+        </w:rPr>
+        <w:t xml:space="preserve"> </w:t>
       </w:r>
       <w:proofErr w:type="spellStart"/>
       <w:r>
@@ -921,7 +937,126 @@
           <w:sz w:val="28"/>
           <w:szCs w:val="28"/>
         </w:rPr>
-        <w:t xml:space="preserve"> 12/12</w:t>
+        <w:t xml:space="preserve"> </w:t>
+      </w:r>
+      <w:r>
+        <w:rPr>
+          <w:sz w:val="28"/>
+          <w:szCs w:val="28"/>
+        </w:rPr>
+        <w:t xml:space="preserve">Sinh </w:t>
+      </w:r>
+      <w:proofErr w:type="spellStart"/>
+      <w:r>
+        <w:rPr>
+          <w:sz w:val="28"/>
+          <w:szCs w:val="28"/>
+        </w:rPr>
+        <w:t>viên</w:t>
+      </w:r>
+      <w:proofErr w:type="spellEnd"/>
+      <w:r>
+        <w:rPr>
+          <w:sz w:val="28"/>
+          <w:szCs w:val="28"/>
+        </w:rPr>
+        <w:t xml:space="preserve"> </w:t>
+      </w:r>
+      <w:proofErr w:type="spellStart"/>
+      <w:r>
+        <w:rPr>
+          <w:sz w:val="28"/>
+          <w:szCs w:val="28"/>
+        </w:rPr>
+        <w:t>năm</w:t>
+      </w:r>
+      <w:proofErr w:type="spellEnd"/>
+      <w:r>
+        <w:rPr>
+          <w:sz w:val="28"/>
+          <w:szCs w:val="28"/>
+        </w:rPr>
+        <w:t xml:space="preserve"> 3 </w:t>
+      </w:r>
+      <w:proofErr w:type="spellStart"/>
+      <w:r>
+        <w:rPr>
+          <w:sz w:val="28"/>
+          <w:szCs w:val="28"/>
+        </w:rPr>
+        <w:t>ngành</w:t>
+      </w:r>
+      <w:proofErr w:type="spellEnd"/>
+      <w:r>
+        <w:rPr>
+          <w:sz w:val="28"/>
+          <w:szCs w:val="28"/>
+        </w:rPr>
+        <w:t xml:space="preserve"> Công </w:t>
+      </w:r>
+      <w:proofErr w:type="spellStart"/>
+      <w:r>
+        <w:rPr>
+          <w:sz w:val="28"/>
+          <w:szCs w:val="28"/>
+        </w:rPr>
+        <w:t>Nghệ</w:t>
+      </w:r>
+      <w:proofErr w:type="spellEnd"/>
+      <w:r>
+        <w:rPr>
+          <w:sz w:val="28"/>
+          <w:szCs w:val="28"/>
+        </w:rPr>
+        <w:t xml:space="preserve"> Thông Tin, Trường </w:t>
+      </w:r>
+      <w:proofErr w:type="spellStart"/>
+      <w:r>
+        <w:rPr>
+          <w:sz w:val="28"/>
+          <w:szCs w:val="28"/>
+        </w:rPr>
+        <w:t>Đại</w:t>
+      </w:r>
+      <w:proofErr w:type="spellEnd"/>
+      <w:r>
+        <w:rPr>
+          <w:sz w:val="28"/>
+          <w:szCs w:val="28"/>
+        </w:rPr>
+        <w:t xml:space="preserve"> </w:t>
+      </w:r>
+      <w:proofErr w:type="spellStart"/>
+      <w:r>
+        <w:rPr>
+          <w:sz w:val="28"/>
+          <w:szCs w:val="28"/>
+        </w:rPr>
+        <w:t>học</w:t>
+      </w:r>
+      <w:proofErr w:type="spellEnd"/>
+      <w:r>
+        <w:rPr>
+          <w:sz w:val="28"/>
+          <w:szCs w:val="28"/>
+        </w:rPr>
+        <w:t xml:space="preserve"> </w:t>
+      </w:r>
+      <w:proofErr w:type="spellStart"/>
+      <w:r>
+        <w:rPr>
+          <w:sz w:val="28"/>
+          <w:szCs w:val="28"/>
+        </w:rPr>
+        <w:t>Tiền</w:t>
+      </w:r>
+      <w:proofErr w:type="spellEnd"/>
+      <w:r>
+        <w:rPr>
+          <w:sz w:val="28"/>
+          <w:szCs w:val="28"/>
+        </w:rPr>
+        <w:t xml:space="preserve"> Giang.</w:t>
       </w:r>
     </w:p>
     <w:p>
@@ -1518,7 +1653,229 @@
           <w:szCs w:val="28"/>
         </w:rPr>
         <w:tab/>
-        <w:t>- Trình độ học vấn/chuyên môn:</w:t>
+        <w:t xml:space="preserve">- </w:t>
+      </w:r>
+      <w:proofErr w:type="spellStart"/>
+      <w:r>
+        <w:rPr>
+          <w:sz w:val="28"/>
+          <w:szCs w:val="28"/>
+        </w:rPr>
+        <w:t>Trình</w:t>
+      </w:r>
+      <w:proofErr w:type="spellEnd"/>
+      <w:r>
+        <w:rPr>
+          <w:sz w:val="28"/>
+          <w:szCs w:val="28"/>
+        </w:rPr>
+        <w:t xml:space="preserve"> </w:t>
+      </w:r>
+      <w:proofErr w:type="spellStart"/>
+      <w:r>
+        <w:rPr>
+          <w:sz w:val="28"/>
+          <w:szCs w:val="28"/>
+        </w:rPr>
+        <w:t>độ</w:t>
+      </w:r>
+      <w:proofErr w:type="spellEnd"/>
+      <w:r>
+        <w:rPr>
+          <w:sz w:val="28"/>
+          <w:szCs w:val="28"/>
+        </w:rPr>
+        <w:t xml:space="preserve"> </w:t>
+      </w:r>
+      <w:proofErr w:type="spellStart"/>
+      <w:r>
+        <w:rPr>
+          <w:sz w:val="28"/>
+          <w:szCs w:val="28"/>
+        </w:rPr>
+        <w:t>học</w:t>
+      </w:r>
+      <w:proofErr w:type="spellEnd"/>
+      <w:r>
+        <w:rPr>
+          <w:sz w:val="28"/>
+          <w:szCs w:val="28"/>
+        </w:rPr>
+        <w:t xml:space="preserve"> </w:t>
+      </w:r>
+      <w:proofErr w:type="spellStart"/>
+      <w:r>
+        <w:rPr>
+          <w:sz w:val="28"/>
+          <w:szCs w:val="28"/>
+        </w:rPr>
+        <w:t>vấn</w:t>
+      </w:r>
+      <w:proofErr w:type="spellEnd"/>
+      <w:r>
+        <w:rPr>
+          <w:sz w:val="28"/>
+          <w:szCs w:val="28"/>
+        </w:rPr>
+        <w:t>/</w:t>
+      </w:r>
+      <w:proofErr w:type="spellStart"/>
+      <w:r>
+        <w:rPr>
+          <w:sz w:val="28"/>
+          <w:szCs w:val="28"/>
+        </w:rPr>
+        <w:t>chuyên</w:t>
+      </w:r>
+      <w:proofErr w:type="spellEnd"/>
+      <w:r>
+        <w:rPr>
+          <w:sz w:val="28"/>
+          <w:szCs w:val="28"/>
+        </w:rPr>
+        <w:t xml:space="preserve"> </w:t>
+      </w:r>
+      <w:proofErr w:type="spellStart"/>
+      <w:r>
+        <w:rPr>
+          <w:sz w:val="28"/>
+          <w:szCs w:val="28"/>
+        </w:rPr>
+        <w:t>môn</w:t>
+      </w:r>
+      <w:proofErr w:type="spellEnd"/>
+      <w:r>
+        <w:rPr>
+          <w:sz w:val="28"/>
+          <w:szCs w:val="28"/>
+        </w:rPr>
+        <w:t>:</w:t>
+      </w:r>
+      <w:r>
+        <w:rPr>
+          <w:sz w:val="28"/>
+          <w:szCs w:val="28"/>
+        </w:rPr>
+        <w:t xml:space="preserve"> </w:t>
+      </w:r>
+      <w:r>
+        <w:rPr>
+          <w:sz w:val="28"/>
+          <w:szCs w:val="28"/>
+        </w:rPr>
+        <w:t xml:space="preserve">Sinh </w:t>
+      </w:r>
+      <w:proofErr w:type="spellStart"/>
+      <w:r>
+        <w:rPr>
+          <w:sz w:val="28"/>
+          <w:szCs w:val="28"/>
+        </w:rPr>
+        <w:t>viên</w:t>
+      </w:r>
+      <w:proofErr w:type="spellEnd"/>
+      <w:r>
+        <w:rPr>
+          <w:sz w:val="28"/>
+          <w:szCs w:val="28"/>
+        </w:rPr>
+        <w:t xml:space="preserve"> </w:t>
+      </w:r>
+      <w:proofErr w:type="spellStart"/>
+      <w:r>
+        <w:rPr>
+          <w:sz w:val="28"/>
+          <w:szCs w:val="28"/>
+        </w:rPr>
+        <w:t>năm</w:t>
+      </w:r>
+      <w:proofErr w:type="spellEnd"/>
+      <w:r>
+        <w:rPr>
+          <w:sz w:val="28"/>
+          <w:szCs w:val="28"/>
+        </w:rPr>
+        <w:t xml:space="preserve"> 3 </w:t>
+      </w:r>
+      <w:proofErr w:type="spellStart"/>
+      <w:r>
+        <w:rPr>
+          <w:sz w:val="28"/>
+          <w:szCs w:val="28"/>
+        </w:rPr>
+        <w:t>ngành</w:t>
+      </w:r>
+      <w:proofErr w:type="spellEnd"/>
+      <w:r>
+        <w:rPr>
+          <w:sz w:val="28"/>
+          <w:szCs w:val="28"/>
+        </w:rPr>
+        <w:t xml:space="preserve"> Công </w:t>
+      </w:r>
+      <w:proofErr w:type="spellStart"/>
+      <w:r>
+        <w:rPr>
+          <w:sz w:val="28"/>
+          <w:szCs w:val="28"/>
+        </w:rPr>
+        <w:t>Nghệ</w:t>
+      </w:r>
+      <w:proofErr w:type="spellEnd"/>
+      <w:r>
+        <w:rPr>
+          <w:sz w:val="28"/>
+          <w:szCs w:val="28"/>
+        </w:rPr>
+        <w:t xml:space="preserve"> Thông Tin, Trường </w:t>
+      </w:r>
+      <w:proofErr w:type="spellStart"/>
+      <w:r>
+        <w:rPr>
+          <w:sz w:val="28"/>
+          <w:szCs w:val="28"/>
+        </w:rPr>
+        <w:t>Đại</w:t>
+      </w:r>
+      <w:proofErr w:type="spellEnd"/>
+      <w:r>
+        <w:rPr>
+          <w:sz w:val="28"/>
+          <w:szCs w:val="28"/>
+        </w:rPr>
+        <w:t xml:space="preserve"> </w:t>
+      </w:r>
+      <w:proofErr w:type="spellStart"/>
+      <w:r>
+        <w:rPr>
+          <w:sz w:val="28"/>
+          <w:szCs w:val="28"/>
+        </w:rPr>
+        <w:t>học</w:t>
+      </w:r>
+      <w:proofErr w:type="spellEnd"/>
+      <w:r>
+        <w:rPr>
+          <w:sz w:val="28"/>
+          <w:szCs w:val="28"/>
+        </w:rPr>
+        <w:t xml:space="preserve"> </w:t>
+      </w:r>
+      <w:proofErr w:type="spellStart"/>
+      <w:r>
+        <w:rPr>
+          <w:sz w:val="28"/>
+          <w:szCs w:val="28"/>
+        </w:rPr>
+        <w:t>Tiền</w:t>
+      </w:r>
+      <w:proofErr w:type="spellEnd"/>
+      <w:r>
+        <w:rPr>
+          <w:sz w:val="28"/>
+          <w:szCs w:val="28"/>
+        </w:rPr>
+        <w:t xml:space="preserve"> Giang.</w:t>
       </w:r>
     </w:p>
     <w:p>
@@ -1856,12 +2213,6 @@
           <w:szCs w:val="28"/>
         </w:rPr>
         <w:tab/>
-      </w:r>
-      <w:r>
-        <w:rPr>
-          <w:sz w:val="28"/>
-          <w:szCs w:val="28"/>
-        </w:rPr>
         <w:t>Nguyễn Văn Trọng Phúc</w:t>
       </w:r>
       <w:r>
@@ -1916,14 +2267,7 @@
           <w:sz w:val="28"/>
           <w:szCs w:val="28"/>
         </w:rPr>
-        <w:t>: N</w:t>
-      </w:r>
-      <w:r>
-        <w:rPr>
-          <w:sz w:val="28"/>
-          <w:szCs w:val="28"/>
-        </w:rPr>
-        <w:t>am</w:t>
+        <w:t>: Nam</w:t>
       </w:r>
     </w:p>
     <w:p>
@@ -1956,14 +2300,7 @@
           <w:sz w:val="28"/>
           <w:szCs w:val="28"/>
         </w:rPr>
-        <w:t xml:space="preserve"> CMND/CCCD:</w:t>
-      </w:r>
-      <w:r>
-        <w:rPr>
-          <w:sz w:val="28"/>
-          <w:szCs w:val="28"/>
-        </w:rPr>
-        <w:t xml:space="preserve"> </w:t>
+        <w:t xml:space="preserve"> CMND/CCCD: </w:t>
       </w:r>
       <w:r>
         <w:rPr>
@@ -2146,6 +2483,141 @@
         </w:rPr>
         <w:t>:</w:t>
       </w:r>
+      <w:r>
+        <w:rPr>
+          <w:sz w:val="28"/>
+          <w:szCs w:val="28"/>
+        </w:rPr>
+        <w:t xml:space="preserve"> </w:t>
+      </w:r>
+      <w:r>
+        <w:rPr>
+          <w:sz w:val="28"/>
+          <w:szCs w:val="28"/>
+        </w:rPr>
+        <w:t xml:space="preserve">Sinh </w:t>
+      </w:r>
+      <w:proofErr w:type="spellStart"/>
+      <w:r>
+        <w:rPr>
+          <w:sz w:val="28"/>
+          <w:szCs w:val="28"/>
+        </w:rPr>
+        <w:t>viên</w:t>
+      </w:r>
+      <w:proofErr w:type="spellEnd"/>
+      <w:r>
+        <w:rPr>
+          <w:sz w:val="28"/>
+          <w:szCs w:val="28"/>
+        </w:rPr>
+        <w:t xml:space="preserve"> </w:t>
+      </w:r>
+      <w:proofErr w:type="spellStart"/>
+      <w:r>
+        <w:rPr>
+          <w:sz w:val="28"/>
+          <w:szCs w:val="28"/>
+        </w:rPr>
+        <w:t>năm</w:t>
+      </w:r>
+      <w:proofErr w:type="spellEnd"/>
+      <w:r>
+        <w:rPr>
+          <w:sz w:val="28"/>
+          <w:szCs w:val="28"/>
+        </w:rPr>
+        <w:t xml:space="preserve"> 3 </w:t>
+      </w:r>
+      <w:proofErr w:type="spellStart"/>
+      <w:r>
+        <w:rPr>
+          <w:sz w:val="28"/>
+          <w:szCs w:val="28"/>
+        </w:rPr>
+        <w:t>ngành</w:t>
+      </w:r>
+      <w:proofErr w:type="spellEnd"/>
+      <w:r>
+        <w:rPr>
+          <w:sz w:val="28"/>
+          <w:szCs w:val="28"/>
+        </w:rPr>
+        <w:t xml:space="preserve"> Công </w:t>
+      </w:r>
+      <w:proofErr w:type="spellStart"/>
+      <w:proofErr w:type="gramStart"/>
+      <w:r>
+        <w:rPr>
+          <w:sz w:val="28"/>
+          <w:szCs w:val="28"/>
+        </w:rPr>
+        <w:t>Nghệ</w:t>
+      </w:r>
+      <w:proofErr w:type="spellEnd"/>
+      <w:r>
+        <w:rPr>
+          <w:sz w:val="28"/>
+          <w:szCs w:val="28"/>
+        </w:rPr>
+        <w:t xml:space="preserve">  Thông</w:t>
+      </w:r>
+      <w:proofErr w:type="gramEnd"/>
+      <w:r>
+        <w:rPr>
+          <w:sz w:val="28"/>
+          <w:szCs w:val="28"/>
+        </w:rPr>
+        <w:t xml:space="preserve"> Tin, Trường </w:t>
+      </w:r>
+      <w:proofErr w:type="spellStart"/>
+      <w:r>
+        <w:rPr>
+          <w:sz w:val="28"/>
+          <w:szCs w:val="28"/>
+        </w:rPr>
+        <w:t>Đại</w:t>
+      </w:r>
+      <w:proofErr w:type="spellEnd"/>
+      <w:r>
+        <w:rPr>
+          <w:sz w:val="28"/>
+          <w:szCs w:val="28"/>
+        </w:rPr>
+        <w:t xml:space="preserve"> </w:t>
+      </w:r>
+      <w:proofErr w:type="spellStart"/>
+      <w:r>
+        <w:rPr>
+          <w:sz w:val="28"/>
+          <w:szCs w:val="28"/>
+        </w:rPr>
+        <w:t>học</w:t>
+      </w:r>
+      <w:proofErr w:type="spellEnd"/>
+      <w:r>
+        <w:rPr>
+          <w:sz w:val="28"/>
+          <w:szCs w:val="28"/>
+        </w:rPr>
+        <w:t xml:space="preserve"> </w:t>
+      </w:r>
+      <w:proofErr w:type="spellStart"/>
+      <w:r>
+        <w:rPr>
+          <w:sz w:val="28"/>
+          <w:szCs w:val="28"/>
+        </w:rPr>
+        <w:t>Tiền</w:t>
+      </w:r>
+      <w:proofErr w:type="spellEnd"/>
+      <w:r>
+        <w:rPr>
+          <w:sz w:val="28"/>
+          <w:szCs w:val="28"/>
+        </w:rPr>
+        <w:t xml:space="preserve"> Giang.</w:t>
+      </w:r>
     </w:p>
     <w:p>
       <w:pPr>
@@ -2252,33 +2724,13 @@
           <w:sz w:val="28"/>
           <w:szCs w:val="28"/>
         </w:rPr>
-        <w:t>phuc</w:t>
-      </w:r>
-      <w:r>
-        <w:rPr>
-          <w:sz w:val="28"/>
-          <w:szCs w:val="28"/>
-        </w:rPr>
-        <w:t>0231010</w:t>
-      </w:r>
-      <w:r>
-        <w:rPr>
-          <w:sz w:val="28"/>
-          <w:szCs w:val="28"/>
-        </w:rPr>
-        <w:t>0</w:t>
-      </w:r>
-      <w:r>
-        <w:rPr>
-          <w:sz w:val="28"/>
-          <w:szCs w:val="28"/>
-        </w:rPr>
-        <w:t>3@@tgu.edu.vn</w:t>
+        <w:t>phuc023101003@@tgu.edu.vn</w:t>
       </w:r>
     </w:p>
     <w:p>
       <w:pPr>
         <w:spacing w:after="120" w:line="264" w:lineRule="auto"/>
+        <w:ind w:firstLine="720"/>
         <w:rPr>
           <w:sz w:val="28"/>
           <w:szCs w:val="28"/>
@@ -2288,57 +2740,77 @@
     <w:p>
       <w:pPr>
         <w:spacing w:after="120" w:line="264" w:lineRule="auto"/>
-        <w:jc w:val="both"/>
-        <w:rPr>
-          <w:b/>
-          <w:sz w:val="28"/>
-          <w:szCs w:val="28"/>
-        </w:rPr>
-      </w:pPr>
-      <w:r>
-        <w:rPr>
-          <w:b/>
-          <w:sz w:val="28"/>
-          <w:szCs w:val="28"/>
-        </w:rPr>
-        <w:t>I</w:t>
-      </w:r>
-      <w:r>
-        <w:rPr>
-          <w:b/>
-          <w:sz w:val="28"/>
-          <w:szCs w:val="28"/>
-        </w:rPr>
-        <w:t>I</w:t>
-      </w:r>
-      <w:r>
-        <w:rPr>
-          <w:b/>
-          <w:sz w:val="28"/>
-          <w:szCs w:val="28"/>
-        </w:rPr>
-        <w:t xml:space="preserve">. </w:t>
-      </w:r>
-      <w:r>
-        <w:rPr>
-          <w:b/>
-          <w:sz w:val="28"/>
-          <w:szCs w:val="28"/>
-        </w:rPr>
-        <w:t>THÔNG TIN DỰ ÁN</w:t>
-      </w:r>
-      <w:r>
-        <w:rPr>
-          <w:b/>
-          <w:sz w:val="28"/>
-          <w:szCs w:val="28"/>
-        </w:rPr>
-        <w:t>:</w:t>
-      </w:r>
+        <w:ind w:firstLine="720"/>
+        <w:rPr>
+          <w:sz w:val="28"/>
+          <w:szCs w:val="28"/>
+        </w:rPr>
+      </w:pPr>
     </w:p>
     <w:p>
       <w:pPr>
         <w:spacing w:after="120" w:line="264" w:lineRule="auto"/>
+        <w:ind w:firstLine="720"/>
+        <w:rPr>
+          <w:sz w:val="28"/>
+          <w:szCs w:val="28"/>
+        </w:rPr>
+      </w:pPr>
+    </w:p>
+    <w:p>
+      <w:pPr>
+        <w:spacing w:after="120" w:line="264" w:lineRule="auto"/>
+        <w:jc w:val="both"/>
+        <w:rPr>
+          <w:b/>
+          <w:sz w:val="28"/>
+          <w:szCs w:val="28"/>
+        </w:rPr>
+      </w:pPr>
+      <w:r>
+        <w:rPr>
+          <w:b/>
+          <w:sz w:val="28"/>
+          <w:szCs w:val="28"/>
+        </w:rPr>
+        <w:t>I</w:t>
+      </w:r>
+      <w:r>
+        <w:rPr>
+          <w:b/>
+          <w:sz w:val="28"/>
+          <w:szCs w:val="28"/>
+        </w:rPr>
+        <w:t>I</w:t>
+      </w:r>
+      <w:r>
+        <w:rPr>
+          <w:b/>
+          <w:sz w:val="28"/>
+          <w:szCs w:val="28"/>
+        </w:rPr>
+        <w:t xml:space="preserve">. </w:t>
+      </w:r>
+      <w:r>
+        <w:rPr>
+          <w:b/>
+          <w:sz w:val="28"/>
+          <w:szCs w:val="28"/>
+        </w:rPr>
+        <w:t>THÔNG TIN DỰ ÁN</w:t>
+      </w:r>
+      <w:r>
+        <w:rPr>
+          <w:b/>
+          <w:sz w:val="28"/>
+          <w:szCs w:val="28"/>
+        </w:rPr>
+        <w:t>:</w:t>
+      </w:r>
+    </w:p>
+    <w:p>
+      <w:pPr>
+        <w:spacing w:after="120" w:line="264" w:lineRule="auto"/>
         <w:rPr>
           <w:sz w:val="28"/>
           <w:szCs w:val="28"/>
@@ -2428,8 +2900,193 @@
           <w:sz w:val="28"/>
           <w:szCs w:val="28"/>
         </w:rPr>
-        <w:t xml:space="preserve"> AI</w:t>
-      </w:r>
+        <w:t xml:space="preserve"> - </w:t>
+      </w:r>
+      <w:proofErr w:type="spellStart"/>
+      <w:r>
+        <w:rPr>
+          <w:sz w:val="28"/>
+          <w:szCs w:val="28"/>
+        </w:rPr>
+        <w:t>Chợ</w:t>
+      </w:r>
+      <w:proofErr w:type="spellEnd"/>
+      <w:r>
+        <w:rPr>
+          <w:sz w:val="28"/>
+          <w:szCs w:val="28"/>
+        </w:rPr>
+        <w:t xml:space="preserve"> </w:t>
+      </w:r>
+      <w:proofErr w:type="spellStart"/>
+      <w:r>
+        <w:rPr>
+          <w:sz w:val="28"/>
+          <w:szCs w:val="28"/>
+        </w:rPr>
+        <w:t>Nhà</w:t>
+      </w:r>
+      <w:proofErr w:type="spellEnd"/>
+      <w:r>
+        <w:rPr>
+          <w:sz w:val="28"/>
+          <w:szCs w:val="28"/>
+        </w:rPr>
+        <w:t xml:space="preserve"> </w:t>
+      </w:r>
+      <w:proofErr w:type="spellStart"/>
+      <w:r>
+        <w:rPr>
+          <w:sz w:val="28"/>
+          <w:szCs w:val="28"/>
+        </w:rPr>
+        <w:t>Nông</w:t>
+      </w:r>
+      <w:proofErr w:type="spellEnd"/>
+      <w:r>
+        <w:rPr>
+          <w:sz w:val="28"/>
+          <w:szCs w:val="28"/>
+        </w:rPr>
+        <w:t xml:space="preserve"> - </w:t>
+      </w:r>
+      <w:proofErr w:type="spellStart"/>
+      <w:r>
+        <w:rPr>
+          <w:sz w:val="28"/>
+          <w:szCs w:val="28"/>
+        </w:rPr>
+        <w:t>Ứng</w:t>
+      </w:r>
+      <w:proofErr w:type="spellEnd"/>
+      <w:r>
+        <w:rPr>
+          <w:sz w:val="28"/>
+          <w:szCs w:val="28"/>
+        </w:rPr>
+        <w:t xml:space="preserve"> </w:t>
+      </w:r>
+      <w:proofErr w:type="spellStart"/>
+      <w:r>
+        <w:rPr>
+          <w:sz w:val="28"/>
+          <w:szCs w:val="28"/>
+        </w:rPr>
+        <w:t>dụng</w:t>
+      </w:r>
+      <w:proofErr w:type="spellEnd"/>
+      <w:r>
+        <w:rPr>
+          <w:sz w:val="28"/>
+          <w:szCs w:val="28"/>
+        </w:rPr>
+        <w:t xml:space="preserve"> AI </w:t>
+      </w:r>
+      <w:proofErr w:type="spellStart"/>
+      <w:r>
+        <w:rPr>
+          <w:sz w:val="28"/>
+          <w:szCs w:val="28"/>
+        </w:rPr>
+        <w:t>định</w:t>
+      </w:r>
+      <w:proofErr w:type="spellEnd"/>
+      <w:r>
+        <w:rPr>
+          <w:sz w:val="28"/>
+          <w:szCs w:val="28"/>
+        </w:rPr>
+        <w:t xml:space="preserve"> </w:t>
+      </w:r>
+      <w:proofErr w:type="spellStart"/>
+      <w:r>
+        <w:rPr>
+          <w:sz w:val="28"/>
+          <w:szCs w:val="28"/>
+        </w:rPr>
+        <w:t>giá</w:t>
+      </w:r>
+      <w:proofErr w:type="spellEnd"/>
+      <w:r>
+        <w:rPr>
+          <w:sz w:val="28"/>
+          <w:szCs w:val="28"/>
+        </w:rPr>
+        <w:t xml:space="preserve"> </w:t>
+      </w:r>
+      <w:proofErr w:type="spellStart"/>
+      <w:r>
+        <w:rPr>
+          <w:sz w:val="28"/>
+          <w:szCs w:val="28"/>
+        </w:rPr>
+        <w:t>và</w:t>
+      </w:r>
+      <w:proofErr w:type="spellEnd"/>
+      <w:r>
+        <w:rPr>
+          <w:sz w:val="28"/>
+          <w:szCs w:val="28"/>
+        </w:rPr>
+        <w:t xml:space="preserve"> </w:t>
+      </w:r>
+      <w:proofErr w:type="spellStart"/>
+      <w:r>
+        <w:rPr>
+          <w:sz w:val="28"/>
+          <w:szCs w:val="28"/>
+        </w:rPr>
+        <w:t>minh</w:t>
+      </w:r>
+      <w:proofErr w:type="spellEnd"/>
+      <w:r>
+        <w:rPr>
+          <w:sz w:val="28"/>
+          <w:szCs w:val="28"/>
+        </w:rPr>
+        <w:t xml:space="preserve"> </w:t>
+      </w:r>
+      <w:proofErr w:type="spellStart"/>
+      <w:r>
+        <w:rPr>
+          <w:sz w:val="28"/>
+          <w:szCs w:val="28"/>
+        </w:rPr>
+        <w:t>bạch</w:t>
+      </w:r>
+      <w:proofErr w:type="spellEnd"/>
+      <w:r>
+        <w:rPr>
+          <w:sz w:val="28"/>
+          <w:szCs w:val="28"/>
+        </w:rPr>
+        <w:t xml:space="preserve"> </w:t>
+      </w:r>
+      <w:proofErr w:type="spellStart"/>
+      <w:r>
+        <w:rPr>
+          <w:sz w:val="28"/>
+          <w:szCs w:val="28"/>
+        </w:rPr>
+        <w:t>nông</w:t>
+      </w:r>
+      <w:proofErr w:type="spellEnd"/>
+      <w:r>
+        <w:rPr>
+          <w:sz w:val="28"/>
+          <w:szCs w:val="28"/>
+        </w:rPr>
+        <w:t xml:space="preserve"> </w:t>
+      </w:r>
+      <w:proofErr w:type="spellStart"/>
+      <w:r>
+        <w:rPr>
+          <w:sz w:val="28"/>
+          <w:szCs w:val="28"/>
+        </w:rPr>
+        <w:t>sản</w:t>
+      </w:r>
+      <w:proofErr w:type="spellEnd"/>
       <w:r>
         <w:rPr>
           <w:sz w:val="28"/>
@@ -2455,7 +3112,6 @@
           <w:szCs w:val="28"/>
           <w:lang w:val="vi-VN"/>
         </w:rPr>
-        <w:lastRenderedPageBreak/>
         <w:t xml:space="preserve">2. </w:t>
       </w:r>
       <w:r>
@@ -2724,7 +3380,7 @@
           <w:sz w:val="28"/>
           <w:szCs w:val="32"/>
         </w:rPr>
-        <w:sym w:font="Wingdings" w:char="F06F"/>
+        <w:sym w:font="Wingdings" w:char="F0FE"/>
       </w:r>
       <w:r>
         <w:rPr>
@@ -3576,7 +4232,25 @@
           <w:sz w:val="28"/>
           <w:szCs w:val="28"/>
         </w:rPr>
-        <w:t xml:space="preserve"> ý cho Ban Tổ chức công bố </w:t>
+        <w:t xml:space="preserve"> ý </w:t>
+      </w:r>
+      <w:proofErr w:type="spellStart"/>
+      <w:r>
+        <w:rPr>
+          <w:spacing w:val="4"/>
+          <w:sz w:val="28"/>
+          <w:szCs w:val="28"/>
+        </w:rPr>
+        <w:t>cho</w:t>
+      </w:r>
+      <w:proofErr w:type="spellEnd"/>
+      <w:r>
+        <w:rPr>
+          <w:spacing w:val="4"/>
+          <w:sz w:val="28"/>
+          <w:szCs w:val="28"/>
+        </w:rPr>
+        <w:t xml:space="preserve"> Ban Tổ chức công bố </w:t>
       </w:r>
       <w:r>
         <w:rPr>
@@ -3798,18 +4472,9 @@
           <w:szCs w:val="28"/>
           <w:lang w:val="vi-VN"/>
         </w:rPr>
+        <w:lastRenderedPageBreak/>
         <w:tab/>
       </w:r>
-    </w:p>
-    <w:p>
-      <w:pPr>
-        <w:rPr>
-          <w:b/>
-          <w:sz w:val="32"/>
-          <w:szCs w:val="32"/>
-          <w:lang w:val="en-GB"/>
-        </w:rPr>
-      </w:pPr>
     </w:p>
     <w:sectPr>
       <w:pgSz w:w="11907" w:h="16840" w:code="9"/>

</xml_diff>

<commit_message>
Sua Task 9: footer-inner khong mo rong o 1280px nhu demo
</commit_message>
<xml_diff>
--- a/docs/BTC - PHIEU DANG KY DU THI 2026-CAOPHUCTHINH.docx
+++ b/docs/BTC - PHIEU DANG KY DU THI 2026-CAOPHUCTHINH.docx
@@ -581,77 +581,230 @@
           <w:szCs w:val="28"/>
         </w:rPr>
         <w:tab/>
+        <w:t>- Họ và tên</w:t>
+      </w:r>
+      <w:r>
+        <w:rPr>
+          <w:sz w:val="28"/>
+          <w:szCs w:val="28"/>
+        </w:rPr>
+        <w:t>: Cao Phúc Thịnh</w:t>
+      </w:r>
+      <w:r>
+        <w:rPr>
+          <w:sz w:val="28"/>
+          <w:szCs w:val="28"/>
+        </w:rPr>
+        <w:tab/>
+      </w:r>
+      <w:r>
+        <w:rPr>
+          <w:sz w:val="28"/>
+          <w:szCs w:val="28"/>
+        </w:rPr>
+        <w:tab/>
+      </w:r>
+      <w:r>
+        <w:rPr>
+          <w:sz w:val="28"/>
+          <w:szCs w:val="28"/>
+        </w:rPr>
+        <w:tab/>
+      </w:r>
+      <w:r>
+        <w:rPr>
+          <w:sz w:val="28"/>
+          <w:szCs w:val="28"/>
+        </w:rPr>
+        <w:tab/>
+        <w:t>- Giới tính:</w:t>
+      </w:r>
+      <w:r>
+        <w:rPr>
+          <w:sz w:val="28"/>
+          <w:szCs w:val="28"/>
+        </w:rPr>
+        <w:t xml:space="preserve"> Nam</w:t>
+      </w:r>
+    </w:p>
+    <w:p>
+      <w:pPr>
+        <w:spacing w:after="120" w:line="264" w:lineRule="auto"/>
+        <w:rPr>
+          <w:sz w:val="28"/>
+          <w:szCs w:val="28"/>
+        </w:rPr>
+      </w:pPr>
+      <w:r>
+        <w:rPr>
+          <w:sz w:val="28"/>
+          <w:szCs w:val="28"/>
+        </w:rPr>
+        <w:tab/>
+      </w:r>
+      <w:r>
+        <w:rPr>
+          <w:sz w:val="28"/>
+          <w:szCs w:val="28"/>
+        </w:rPr>
+        <w:t>- Số CMND/CCCD:</w:t>
+      </w:r>
+      <w:r>
+        <w:rPr>
+          <w:sz w:val="28"/>
+          <w:szCs w:val="28"/>
+        </w:rPr>
+        <w:t xml:space="preserve"> 083205010881</w:t>
+      </w:r>
+      <w:r>
+        <w:rPr>
+          <w:sz w:val="28"/>
+          <w:szCs w:val="28"/>
+        </w:rPr>
+        <w:tab/>
+      </w:r>
+      <w:r>
+        <w:rPr>
+          <w:sz w:val="28"/>
+          <w:szCs w:val="28"/>
+        </w:rPr>
+        <w:tab/>
+      </w:r>
+      <w:r>
+        <w:rPr>
+          <w:sz w:val="28"/>
+          <w:szCs w:val="28"/>
+        </w:rPr>
+        <w:tab/>
+      </w:r>
+      <w:r>
+        <w:rPr>
+          <w:sz w:val="28"/>
+          <w:szCs w:val="28"/>
+        </w:rPr>
+        <w:t>- Năm sinh:</w:t>
+      </w:r>
+      <w:r>
+        <w:rPr>
+          <w:sz w:val="28"/>
+          <w:szCs w:val="28"/>
+        </w:rPr>
+        <w:t xml:space="preserve"> 2005</w:t>
+      </w:r>
+      <w:r>
+        <w:rPr>
+          <w:sz w:val="28"/>
+          <w:szCs w:val="28"/>
+        </w:rPr>
+        <w:tab/>
+      </w:r>
+    </w:p>
+    <w:p>
+      <w:pPr>
+        <w:spacing w:after="120" w:line="264" w:lineRule="auto"/>
+        <w:rPr>
+          <w:sz w:val="28"/>
+          <w:szCs w:val="28"/>
+        </w:rPr>
+      </w:pPr>
+      <w:r>
+        <w:rPr>
+          <w:sz w:val="28"/>
+          <w:szCs w:val="28"/>
+        </w:rPr>
+        <w:tab/>
+        <w:t>- Trình độ học vấn</w:t>
+      </w:r>
+      <w:r>
+        <w:rPr>
+          <w:sz w:val="28"/>
+          <w:szCs w:val="28"/>
+        </w:rPr>
+        <w:t>/chuyên môn</w:t>
+      </w:r>
+      <w:r>
+        <w:rPr>
+          <w:sz w:val="28"/>
+          <w:szCs w:val="28"/>
+        </w:rPr>
+        <w:t>:</w:t>
+      </w:r>
+      <w:r>
+        <w:rPr>
+          <w:sz w:val="28"/>
+          <w:szCs w:val="28"/>
+        </w:rPr>
+        <w:t xml:space="preserve"> </w:t>
+      </w:r>
+      <w:r>
+        <w:rPr>
+          <w:sz w:val="28"/>
+          <w:szCs w:val="28"/>
+        </w:rPr>
+        <w:t>Sinh viên năm 3 ngành Công Nghệ Thông Tin, Trường Đại học Tiền Giang.</w:t>
+      </w:r>
+    </w:p>
+    <w:p>
+      <w:pPr>
+        <w:spacing w:after="120" w:line="264" w:lineRule="auto"/>
+        <w:rPr>
+          <w:sz w:val="28"/>
+          <w:szCs w:val="28"/>
+        </w:rPr>
+      </w:pPr>
+      <w:r>
+        <w:rPr>
+          <w:sz w:val="28"/>
+          <w:szCs w:val="28"/>
+        </w:rPr>
+        <w:tab/>
+        <w:t>- Số đ</w:t>
+      </w:r>
+      <w:r>
+        <w:rPr>
+          <w:sz w:val="28"/>
+          <w:szCs w:val="28"/>
+        </w:rPr>
+        <w:t xml:space="preserve">iện thoại: </w:t>
+      </w:r>
+      <w:r>
+        <w:rPr>
+          <w:sz w:val="28"/>
+          <w:szCs w:val="28"/>
+        </w:rPr>
+        <w:t>0326313224</w:t>
+      </w:r>
+      <w:r>
+        <w:rPr>
+          <w:sz w:val="28"/>
+          <w:szCs w:val="28"/>
+        </w:rPr>
+        <w:tab/>
         <w:t xml:space="preserve">- </w:t>
       </w:r>
-      <w:proofErr w:type="spellStart"/>
-      <w:r>
-        <w:rPr>
-          <w:sz w:val="28"/>
-          <w:szCs w:val="28"/>
-        </w:rPr>
-        <w:t>Họ</w:t>
-      </w:r>
-      <w:proofErr w:type="spellEnd"/>
-      <w:r>
-        <w:rPr>
-          <w:sz w:val="28"/>
-          <w:szCs w:val="28"/>
-        </w:rPr>
-        <w:t xml:space="preserve"> </w:t>
-      </w:r>
-      <w:proofErr w:type="spellStart"/>
-      <w:r>
-        <w:rPr>
-          <w:sz w:val="28"/>
-          <w:szCs w:val="28"/>
-        </w:rPr>
-        <w:t>và</w:t>
-      </w:r>
-      <w:proofErr w:type="spellEnd"/>
-      <w:r>
-        <w:rPr>
-          <w:sz w:val="28"/>
-          <w:szCs w:val="28"/>
-        </w:rPr>
-        <w:t xml:space="preserve"> </w:t>
-      </w:r>
-      <w:proofErr w:type="spellStart"/>
-      <w:r>
-        <w:rPr>
-          <w:sz w:val="28"/>
-          <w:szCs w:val="28"/>
-        </w:rPr>
-        <w:t>tên</w:t>
-      </w:r>
-      <w:proofErr w:type="spellEnd"/>
-      <w:r>
-        <w:rPr>
-          <w:sz w:val="28"/>
-          <w:szCs w:val="28"/>
-        </w:rPr>
-        <w:t>: Cao Phúc Thịnh</w:t>
-      </w:r>
-      <w:r>
-        <w:rPr>
-          <w:sz w:val="28"/>
-          <w:szCs w:val="28"/>
-        </w:rPr>
-        <w:tab/>
-      </w:r>
-      <w:r>
-        <w:rPr>
-          <w:sz w:val="28"/>
-          <w:szCs w:val="28"/>
-        </w:rPr>
-        <w:tab/>
-      </w:r>
-      <w:r>
-        <w:rPr>
-          <w:sz w:val="28"/>
-          <w:szCs w:val="28"/>
-        </w:rPr>
-        <w:tab/>
-      </w:r>
+      <w:r>
+        <w:rPr>
+          <w:sz w:val="28"/>
+          <w:szCs w:val="28"/>
+        </w:rPr>
+        <w:t xml:space="preserve">Email: </w:t>
+      </w:r>
+      <w:r>
+        <w:rPr>
+          <w:sz w:val="28"/>
+          <w:szCs w:val="28"/>
+        </w:rPr>
+        <w:t>thinh023101057@tgu.edu.vn</w:t>
+      </w:r>
+    </w:p>
+    <w:p>
+      <w:pPr>
+        <w:spacing w:after="120" w:line="264" w:lineRule="auto"/>
+        <w:rPr>
+          <w:sz w:val="28"/>
+          <w:szCs w:val="28"/>
+        </w:rPr>
+      </w:pPr>
       <w:r>
         <w:rPr>
           <w:sz w:val="28"/>
@@ -660,649 +813,19 @@
         <w:tab/>
         <w:t xml:space="preserve">- </w:t>
       </w:r>
-      <w:proofErr w:type="spellStart"/>
-      <w:r>
-        <w:rPr>
-          <w:sz w:val="28"/>
-          <w:szCs w:val="28"/>
-        </w:rPr>
-        <w:t>Giới</w:t>
-      </w:r>
-      <w:proofErr w:type="spellEnd"/>
-      <w:r>
-        <w:rPr>
-          <w:sz w:val="28"/>
-          <w:szCs w:val="28"/>
-        </w:rPr>
-        <w:t xml:space="preserve"> </w:t>
-      </w:r>
-      <w:proofErr w:type="spellStart"/>
-      <w:r>
-        <w:rPr>
-          <w:sz w:val="28"/>
-          <w:szCs w:val="28"/>
-        </w:rPr>
-        <w:t>tính</w:t>
-      </w:r>
-      <w:proofErr w:type="spellEnd"/>
-      <w:r>
-        <w:rPr>
-          <w:sz w:val="28"/>
-          <w:szCs w:val="28"/>
-        </w:rPr>
-        <w:t>:</w:t>
-      </w:r>
-      <w:r>
-        <w:rPr>
-          <w:sz w:val="28"/>
-          <w:szCs w:val="28"/>
-        </w:rPr>
-        <w:t xml:space="preserve"> Nam</w:t>
-      </w:r>
-    </w:p>
-    <w:p>
-      <w:pPr>
-        <w:spacing w:after="120" w:line="264" w:lineRule="auto"/>
-        <w:rPr>
-          <w:sz w:val="28"/>
-          <w:szCs w:val="28"/>
-        </w:rPr>
-      </w:pPr>
-      <w:r>
-        <w:rPr>
-          <w:sz w:val="28"/>
-          <w:szCs w:val="28"/>
-        </w:rPr>
-        <w:tab/>
-      </w:r>
-      <w:r>
-        <w:rPr>
-          <w:sz w:val="28"/>
-          <w:szCs w:val="28"/>
-        </w:rPr>
-        <w:t xml:space="preserve">- </w:t>
-      </w:r>
-      <w:proofErr w:type="spellStart"/>
-      <w:r>
-        <w:rPr>
-          <w:sz w:val="28"/>
-          <w:szCs w:val="28"/>
-        </w:rPr>
-        <w:t>Số</w:t>
-      </w:r>
-      <w:proofErr w:type="spellEnd"/>
-      <w:r>
-        <w:rPr>
-          <w:sz w:val="28"/>
-          <w:szCs w:val="28"/>
-        </w:rPr>
-        <w:t xml:space="preserve"> CMND/CCCD:</w:t>
-      </w:r>
-      <w:r>
-        <w:rPr>
-          <w:sz w:val="28"/>
-          <w:szCs w:val="28"/>
-        </w:rPr>
-        <w:t xml:space="preserve"> 083205010881</w:t>
-      </w:r>
-      <w:r>
-        <w:rPr>
-          <w:sz w:val="28"/>
-          <w:szCs w:val="28"/>
-        </w:rPr>
-        <w:tab/>
-      </w:r>
-      <w:r>
-        <w:rPr>
-          <w:sz w:val="28"/>
-          <w:szCs w:val="28"/>
-        </w:rPr>
-        <w:tab/>
-      </w:r>
-      <w:r>
-        <w:rPr>
-          <w:sz w:val="28"/>
-          <w:szCs w:val="28"/>
-        </w:rPr>
-        <w:tab/>
-      </w:r>
-      <w:r>
-        <w:rPr>
-          <w:sz w:val="28"/>
-          <w:szCs w:val="28"/>
-        </w:rPr>
-        <w:t xml:space="preserve">- </w:t>
-      </w:r>
-      <w:proofErr w:type="spellStart"/>
-      <w:r>
-        <w:rPr>
-          <w:sz w:val="28"/>
-          <w:szCs w:val="28"/>
-        </w:rPr>
-        <w:t>Năm</w:t>
-      </w:r>
-      <w:proofErr w:type="spellEnd"/>
-      <w:r>
-        <w:rPr>
-          <w:sz w:val="28"/>
-          <w:szCs w:val="28"/>
-        </w:rPr>
-        <w:t xml:space="preserve"> </w:t>
-      </w:r>
-      <w:proofErr w:type="spellStart"/>
-      <w:r>
-        <w:rPr>
-          <w:sz w:val="28"/>
-          <w:szCs w:val="28"/>
-        </w:rPr>
-        <w:t>sinh</w:t>
-      </w:r>
-      <w:proofErr w:type="spellEnd"/>
-      <w:r>
-        <w:rPr>
-          <w:sz w:val="28"/>
-          <w:szCs w:val="28"/>
-        </w:rPr>
-        <w:t>:</w:t>
-      </w:r>
-      <w:r>
-        <w:rPr>
-          <w:sz w:val="28"/>
-          <w:szCs w:val="28"/>
-        </w:rPr>
-        <w:t xml:space="preserve"> 2005</w:t>
-      </w:r>
-      <w:r>
-        <w:rPr>
-          <w:sz w:val="28"/>
-          <w:szCs w:val="28"/>
-        </w:rPr>
-        <w:tab/>
-      </w:r>
-    </w:p>
-    <w:p>
-      <w:pPr>
-        <w:spacing w:after="120" w:line="264" w:lineRule="auto"/>
-        <w:rPr>
-          <w:sz w:val="28"/>
-          <w:szCs w:val="28"/>
-        </w:rPr>
-      </w:pPr>
-      <w:r>
-        <w:rPr>
-          <w:sz w:val="28"/>
-          <w:szCs w:val="28"/>
-        </w:rPr>
-        <w:tab/>
-        <w:t xml:space="preserve">- </w:t>
-      </w:r>
-      <w:proofErr w:type="spellStart"/>
-      <w:r>
-        <w:rPr>
-          <w:sz w:val="28"/>
-          <w:szCs w:val="28"/>
-        </w:rPr>
-        <w:t>Trình</w:t>
-      </w:r>
-      <w:proofErr w:type="spellEnd"/>
-      <w:r>
-        <w:rPr>
-          <w:sz w:val="28"/>
-          <w:szCs w:val="28"/>
-        </w:rPr>
-        <w:t xml:space="preserve"> </w:t>
-      </w:r>
-      <w:proofErr w:type="spellStart"/>
-      <w:r>
-        <w:rPr>
-          <w:sz w:val="28"/>
-          <w:szCs w:val="28"/>
-        </w:rPr>
-        <w:t>độ</w:t>
-      </w:r>
-      <w:proofErr w:type="spellEnd"/>
-      <w:r>
-        <w:rPr>
-          <w:sz w:val="28"/>
-          <w:szCs w:val="28"/>
-        </w:rPr>
-        <w:t xml:space="preserve"> </w:t>
-      </w:r>
-      <w:proofErr w:type="spellStart"/>
-      <w:r>
-        <w:rPr>
-          <w:sz w:val="28"/>
-          <w:szCs w:val="28"/>
-        </w:rPr>
-        <w:t>học</w:t>
-      </w:r>
-      <w:proofErr w:type="spellEnd"/>
-      <w:r>
-        <w:rPr>
-          <w:sz w:val="28"/>
-          <w:szCs w:val="28"/>
-        </w:rPr>
-        <w:t xml:space="preserve"> </w:t>
-      </w:r>
-      <w:proofErr w:type="spellStart"/>
-      <w:r>
-        <w:rPr>
-          <w:sz w:val="28"/>
-          <w:szCs w:val="28"/>
-        </w:rPr>
-        <w:t>vấn</w:t>
-      </w:r>
-      <w:proofErr w:type="spellEnd"/>
-      <w:r>
-        <w:rPr>
-          <w:sz w:val="28"/>
-          <w:szCs w:val="28"/>
-        </w:rPr>
-        <w:t>/</w:t>
-      </w:r>
-      <w:proofErr w:type="spellStart"/>
-      <w:r>
-        <w:rPr>
-          <w:sz w:val="28"/>
-          <w:szCs w:val="28"/>
-        </w:rPr>
-        <w:t>chuyên</w:t>
-      </w:r>
-      <w:proofErr w:type="spellEnd"/>
-      <w:r>
-        <w:rPr>
-          <w:sz w:val="28"/>
-          <w:szCs w:val="28"/>
-        </w:rPr>
-        <w:t xml:space="preserve"> </w:t>
-      </w:r>
-      <w:proofErr w:type="spellStart"/>
-      <w:r>
-        <w:rPr>
-          <w:sz w:val="28"/>
-          <w:szCs w:val="28"/>
-        </w:rPr>
-        <w:t>môn</w:t>
-      </w:r>
-      <w:proofErr w:type="spellEnd"/>
-      <w:r>
-        <w:rPr>
-          <w:sz w:val="28"/>
-          <w:szCs w:val="28"/>
-        </w:rPr>
-        <w:t>:</w:t>
-      </w:r>
-      <w:r>
-        <w:rPr>
-          <w:sz w:val="28"/>
-          <w:szCs w:val="28"/>
-        </w:rPr>
-        <w:t xml:space="preserve"> </w:t>
-      </w:r>
-      <w:r>
-        <w:rPr>
-          <w:sz w:val="28"/>
-          <w:szCs w:val="28"/>
-        </w:rPr>
-        <w:t xml:space="preserve">Sinh </w:t>
-      </w:r>
-      <w:proofErr w:type="spellStart"/>
-      <w:r>
-        <w:rPr>
-          <w:sz w:val="28"/>
-          <w:szCs w:val="28"/>
-        </w:rPr>
-        <w:t>viên</w:t>
-      </w:r>
-      <w:proofErr w:type="spellEnd"/>
-      <w:r>
-        <w:rPr>
-          <w:sz w:val="28"/>
-          <w:szCs w:val="28"/>
-        </w:rPr>
-        <w:t xml:space="preserve"> </w:t>
-      </w:r>
-      <w:proofErr w:type="spellStart"/>
-      <w:r>
-        <w:rPr>
-          <w:sz w:val="28"/>
-          <w:szCs w:val="28"/>
-        </w:rPr>
-        <w:t>năm</w:t>
-      </w:r>
-      <w:proofErr w:type="spellEnd"/>
-      <w:r>
-        <w:rPr>
-          <w:sz w:val="28"/>
-          <w:szCs w:val="28"/>
-        </w:rPr>
-        <w:t xml:space="preserve"> 3 </w:t>
-      </w:r>
-      <w:proofErr w:type="spellStart"/>
-      <w:r>
-        <w:rPr>
-          <w:sz w:val="28"/>
-          <w:szCs w:val="28"/>
-        </w:rPr>
-        <w:t>ngành</w:t>
-      </w:r>
-      <w:proofErr w:type="spellEnd"/>
-      <w:r>
-        <w:rPr>
-          <w:sz w:val="28"/>
-          <w:szCs w:val="28"/>
-        </w:rPr>
-        <w:t xml:space="preserve"> Công </w:t>
-      </w:r>
-      <w:proofErr w:type="spellStart"/>
-      <w:r>
-        <w:rPr>
-          <w:sz w:val="28"/>
-          <w:szCs w:val="28"/>
-        </w:rPr>
-        <w:t>Nghệ</w:t>
-      </w:r>
-      <w:proofErr w:type="spellEnd"/>
-      <w:r>
-        <w:rPr>
-          <w:sz w:val="28"/>
-          <w:szCs w:val="28"/>
-        </w:rPr>
-        <w:t xml:space="preserve"> Thông Tin, Trường </w:t>
-      </w:r>
-      <w:proofErr w:type="spellStart"/>
-      <w:r>
-        <w:rPr>
-          <w:sz w:val="28"/>
-          <w:szCs w:val="28"/>
-        </w:rPr>
-        <w:t>Đại</w:t>
-      </w:r>
-      <w:proofErr w:type="spellEnd"/>
-      <w:r>
-        <w:rPr>
-          <w:sz w:val="28"/>
-          <w:szCs w:val="28"/>
-        </w:rPr>
-        <w:t xml:space="preserve"> </w:t>
-      </w:r>
-      <w:proofErr w:type="spellStart"/>
-      <w:r>
-        <w:rPr>
-          <w:sz w:val="28"/>
-          <w:szCs w:val="28"/>
-        </w:rPr>
-        <w:t>học</w:t>
-      </w:r>
-      <w:proofErr w:type="spellEnd"/>
-      <w:r>
-        <w:rPr>
-          <w:sz w:val="28"/>
-          <w:szCs w:val="28"/>
-        </w:rPr>
-        <w:t xml:space="preserve"> </w:t>
-      </w:r>
-      <w:proofErr w:type="spellStart"/>
-      <w:r>
-        <w:rPr>
-          <w:sz w:val="28"/>
-          <w:szCs w:val="28"/>
-        </w:rPr>
-        <w:t>Tiền</w:t>
-      </w:r>
-      <w:proofErr w:type="spellEnd"/>
-      <w:r>
-        <w:rPr>
-          <w:sz w:val="28"/>
-          <w:szCs w:val="28"/>
-        </w:rPr>
-        <w:t xml:space="preserve"> Giang.</w:t>
-      </w:r>
-    </w:p>
-    <w:p>
-      <w:pPr>
-        <w:spacing w:after="120" w:line="264" w:lineRule="auto"/>
-        <w:rPr>
-          <w:sz w:val="28"/>
-          <w:szCs w:val="28"/>
-        </w:rPr>
-      </w:pPr>
-      <w:r>
-        <w:rPr>
-          <w:sz w:val="28"/>
-          <w:szCs w:val="28"/>
-        </w:rPr>
-        <w:tab/>
-        <w:t xml:space="preserve">- </w:t>
-      </w:r>
-      <w:proofErr w:type="spellStart"/>
-      <w:r>
-        <w:rPr>
-          <w:sz w:val="28"/>
-          <w:szCs w:val="28"/>
-        </w:rPr>
-        <w:t>Số</w:t>
-      </w:r>
-      <w:proofErr w:type="spellEnd"/>
-      <w:r>
-        <w:rPr>
-          <w:sz w:val="28"/>
-          <w:szCs w:val="28"/>
-        </w:rPr>
-        <w:t xml:space="preserve"> </w:t>
-      </w:r>
-      <w:proofErr w:type="spellStart"/>
-      <w:r>
-        <w:rPr>
-          <w:sz w:val="28"/>
-          <w:szCs w:val="28"/>
-        </w:rPr>
-        <w:t>đ</w:t>
-      </w:r>
-      <w:r>
-        <w:rPr>
-          <w:sz w:val="28"/>
-          <w:szCs w:val="28"/>
-        </w:rPr>
-        <w:t>iện</w:t>
-      </w:r>
-      <w:proofErr w:type="spellEnd"/>
-      <w:r>
-        <w:rPr>
-          <w:sz w:val="28"/>
-          <w:szCs w:val="28"/>
-        </w:rPr>
-        <w:t xml:space="preserve"> </w:t>
-      </w:r>
-      <w:proofErr w:type="spellStart"/>
-      <w:r>
-        <w:rPr>
-          <w:sz w:val="28"/>
-          <w:szCs w:val="28"/>
-        </w:rPr>
-        <w:t>thoại</w:t>
-      </w:r>
-      <w:proofErr w:type="spellEnd"/>
-      <w:r>
-        <w:rPr>
-          <w:sz w:val="28"/>
-          <w:szCs w:val="28"/>
-        </w:rPr>
-        <w:t xml:space="preserve">: </w:t>
-      </w:r>
-      <w:r>
-        <w:rPr>
-          <w:sz w:val="28"/>
-          <w:szCs w:val="28"/>
-        </w:rPr>
-        <w:t>0326313224</w:t>
-      </w:r>
-      <w:r>
-        <w:rPr>
-          <w:sz w:val="28"/>
-          <w:szCs w:val="28"/>
-        </w:rPr>
-        <w:tab/>
-        <w:t xml:space="preserve">- </w:t>
-      </w:r>
-      <w:r>
-        <w:rPr>
-          <w:sz w:val="28"/>
-          <w:szCs w:val="28"/>
-        </w:rPr>
-        <w:t xml:space="preserve">Email: </w:t>
-      </w:r>
-      <w:r>
-        <w:rPr>
-          <w:sz w:val="28"/>
-          <w:szCs w:val="28"/>
-        </w:rPr>
-        <w:t>thinh023101057@tgu.edu.vn</w:t>
-      </w:r>
-    </w:p>
-    <w:p>
-      <w:pPr>
-        <w:spacing w:after="120" w:line="264" w:lineRule="auto"/>
-        <w:rPr>
-          <w:sz w:val="28"/>
-          <w:szCs w:val="28"/>
-        </w:rPr>
-      </w:pPr>
-      <w:r>
-        <w:rPr>
-          <w:sz w:val="28"/>
-          <w:szCs w:val="28"/>
-        </w:rPr>
-        <w:tab/>
-        <w:t xml:space="preserve">- </w:t>
-      </w:r>
-      <w:proofErr w:type="spellStart"/>
-      <w:r>
-        <w:rPr>
-          <w:sz w:val="28"/>
-          <w:szCs w:val="28"/>
-        </w:rPr>
-        <w:t>Địa</w:t>
-      </w:r>
-      <w:proofErr w:type="spellEnd"/>
-      <w:r>
-        <w:rPr>
-          <w:sz w:val="28"/>
-          <w:szCs w:val="28"/>
-        </w:rPr>
-        <w:t xml:space="preserve"> </w:t>
-      </w:r>
-      <w:proofErr w:type="spellStart"/>
-      <w:r>
-        <w:rPr>
-          <w:sz w:val="28"/>
-          <w:szCs w:val="28"/>
-        </w:rPr>
-        <w:t>chỉ</w:t>
-      </w:r>
-      <w:proofErr w:type="spellEnd"/>
-      <w:r>
-        <w:rPr>
-          <w:sz w:val="28"/>
-          <w:szCs w:val="28"/>
-        </w:rPr>
-        <w:t xml:space="preserve">: </w:t>
-      </w:r>
-      <w:proofErr w:type="spellStart"/>
-      <w:r>
-        <w:rPr>
-          <w:sz w:val="28"/>
-          <w:szCs w:val="28"/>
-        </w:rPr>
-        <w:t>số</w:t>
-      </w:r>
-      <w:proofErr w:type="spellEnd"/>
-      <w:r>
-        <w:rPr>
-          <w:sz w:val="28"/>
-          <w:szCs w:val="28"/>
-        </w:rPr>
-        <w:t xml:space="preserve"> 140, </w:t>
-      </w:r>
-      <w:proofErr w:type="spellStart"/>
-      <w:r>
-        <w:rPr>
-          <w:sz w:val="28"/>
-          <w:szCs w:val="28"/>
-        </w:rPr>
-        <w:t>ấp</w:t>
-      </w:r>
-      <w:proofErr w:type="spellEnd"/>
-      <w:r>
-        <w:rPr>
-          <w:sz w:val="28"/>
-          <w:szCs w:val="28"/>
-        </w:rPr>
-        <w:t xml:space="preserve"> Bình Long, </w:t>
-      </w:r>
-      <w:proofErr w:type="spellStart"/>
-      <w:r>
-        <w:rPr>
-          <w:sz w:val="28"/>
-          <w:szCs w:val="28"/>
-        </w:rPr>
-        <w:t>xã</w:t>
-      </w:r>
-      <w:proofErr w:type="spellEnd"/>
-      <w:r>
-        <w:rPr>
-          <w:sz w:val="28"/>
-          <w:szCs w:val="28"/>
-        </w:rPr>
-        <w:t xml:space="preserve"> Châu </w:t>
-      </w:r>
-      <w:proofErr w:type="spellStart"/>
-      <w:r>
-        <w:rPr>
-          <w:sz w:val="28"/>
-          <w:szCs w:val="28"/>
-        </w:rPr>
-        <w:t>Hòa</w:t>
-      </w:r>
-      <w:proofErr w:type="spellEnd"/>
-      <w:r>
-        <w:rPr>
-          <w:sz w:val="28"/>
-          <w:szCs w:val="28"/>
-        </w:rPr>
-        <w:t xml:space="preserve">, </w:t>
-      </w:r>
-      <w:proofErr w:type="spellStart"/>
-      <w:r>
-        <w:rPr>
-          <w:sz w:val="28"/>
-          <w:szCs w:val="28"/>
-        </w:rPr>
-        <w:t>tỉnh</w:t>
-      </w:r>
-      <w:proofErr w:type="spellEnd"/>
-      <w:r>
-        <w:rPr>
-          <w:sz w:val="28"/>
-          <w:szCs w:val="28"/>
-        </w:rPr>
-        <w:t xml:space="preserve"> </w:t>
-      </w:r>
-      <w:proofErr w:type="spellStart"/>
-      <w:r>
-        <w:rPr>
-          <w:sz w:val="28"/>
-          <w:szCs w:val="28"/>
-        </w:rPr>
-        <w:t>Vĩnh</w:t>
-      </w:r>
-      <w:proofErr w:type="spellEnd"/>
-      <w:r>
-        <w:rPr>
-          <w:sz w:val="28"/>
-          <w:szCs w:val="28"/>
-        </w:rPr>
-        <w:t xml:space="preserve"> Long </w:t>
+      <w:r>
+        <w:rPr>
+          <w:sz w:val="28"/>
+          <w:szCs w:val="28"/>
+        </w:rPr>
+        <w:t xml:space="preserve">Địa chỉ: </w:t>
+      </w:r>
+      <w:r>
+        <w:rPr>
+          <w:sz w:val="28"/>
+          <w:szCs w:val="28"/>
+        </w:rPr>
+        <w:t xml:space="preserve">số 140, ấp Bình Long, xã Châu Hòa, tỉnh Vĩnh Long </w:t>
       </w:r>
     </w:p>
     <w:p>
@@ -1406,571 +929,194 @@
           <w:szCs w:val="28"/>
         </w:rPr>
         <w:tab/>
+        <w:t>- Họ và tên:</w:t>
+      </w:r>
+      <w:r>
+        <w:rPr>
+          <w:sz w:val="28"/>
+          <w:szCs w:val="28"/>
+        </w:rPr>
+        <w:tab/>
+      </w:r>
+      <w:r>
+        <w:rPr>
+          <w:sz w:val="28"/>
+          <w:szCs w:val="28"/>
+        </w:rPr>
+        <w:t>Mai Ngọc Anh Đào</w:t>
+      </w:r>
+      <w:r>
+        <w:rPr>
+          <w:sz w:val="28"/>
+          <w:szCs w:val="28"/>
+        </w:rPr>
+        <w:tab/>
+      </w:r>
+      <w:r>
+        <w:rPr>
+          <w:sz w:val="28"/>
+          <w:szCs w:val="28"/>
+        </w:rPr>
+        <w:tab/>
+      </w:r>
+      <w:r>
+        <w:rPr>
+          <w:sz w:val="28"/>
+          <w:szCs w:val="28"/>
+        </w:rPr>
+        <w:tab/>
+      </w:r>
+      <w:r>
+        <w:rPr>
+          <w:sz w:val="28"/>
+          <w:szCs w:val="28"/>
+        </w:rPr>
+        <w:t>- Giới tính:</w:t>
+      </w:r>
+      <w:r>
+        <w:rPr>
+          <w:sz w:val="28"/>
+          <w:szCs w:val="28"/>
+        </w:rPr>
+        <w:t xml:space="preserve"> Nữ</w:t>
+      </w:r>
+    </w:p>
+    <w:p>
+      <w:pPr>
+        <w:spacing w:after="120" w:line="264" w:lineRule="auto"/>
+        <w:rPr>
+          <w:sz w:val="28"/>
+          <w:szCs w:val="28"/>
+        </w:rPr>
+      </w:pPr>
+      <w:r>
+        <w:rPr>
+          <w:sz w:val="28"/>
+          <w:szCs w:val="28"/>
+        </w:rPr>
+        <w:tab/>
+        <w:t>- Số CMND/CCCD:</w:t>
+      </w:r>
+      <w:r>
+        <w:rPr>
+          <w:sz w:val="28"/>
+          <w:szCs w:val="28"/>
+        </w:rPr>
+        <w:t xml:space="preserve"> 079305031638</w:t>
+      </w:r>
+      <w:r>
+        <w:rPr>
+          <w:sz w:val="28"/>
+          <w:szCs w:val="28"/>
+        </w:rPr>
+        <w:tab/>
+      </w:r>
+      <w:r>
+        <w:rPr>
+          <w:sz w:val="28"/>
+          <w:szCs w:val="28"/>
+        </w:rPr>
+        <w:tab/>
+      </w:r>
+      <w:r>
+        <w:rPr>
+          <w:sz w:val="28"/>
+          <w:szCs w:val="28"/>
+        </w:rPr>
+        <w:tab/>
+        <w:t>- Năm sinh:</w:t>
+      </w:r>
+      <w:r>
+        <w:rPr>
+          <w:sz w:val="28"/>
+          <w:szCs w:val="28"/>
+        </w:rPr>
+        <w:t xml:space="preserve"> 2005</w:t>
+      </w:r>
+      <w:r>
+        <w:rPr>
+          <w:sz w:val="28"/>
+          <w:szCs w:val="28"/>
+        </w:rPr>
+        <w:tab/>
+      </w:r>
+    </w:p>
+    <w:p>
+      <w:pPr>
+        <w:spacing w:after="120" w:line="264" w:lineRule="auto"/>
+        <w:rPr>
+          <w:sz w:val="28"/>
+          <w:szCs w:val="28"/>
+        </w:rPr>
+      </w:pPr>
+      <w:r>
+        <w:rPr>
+          <w:sz w:val="28"/>
+          <w:szCs w:val="28"/>
+        </w:rPr>
+        <w:tab/>
+        <w:t>- Trình độ học vấn/chuyên môn:</w:t>
+      </w:r>
+      <w:r>
+        <w:rPr>
+          <w:sz w:val="28"/>
+          <w:szCs w:val="28"/>
+        </w:rPr>
+        <w:t xml:space="preserve"> </w:t>
+      </w:r>
+      <w:r>
+        <w:rPr>
+          <w:sz w:val="28"/>
+          <w:szCs w:val="28"/>
+        </w:rPr>
+        <w:t>Sinh viên năm 3 ngành Công Nghệ Thông Tin, Trường Đại học Tiền Giang.</w:t>
+      </w:r>
+    </w:p>
+    <w:p>
+      <w:pPr>
+        <w:spacing w:after="120" w:line="264" w:lineRule="auto"/>
+        <w:rPr>
+          <w:sz w:val="28"/>
+          <w:szCs w:val="28"/>
+        </w:rPr>
+      </w:pPr>
+      <w:r>
+        <w:rPr>
+          <w:sz w:val="28"/>
+          <w:szCs w:val="28"/>
+        </w:rPr>
+        <w:tab/>
+        <w:t>- Số đ</w:t>
+      </w:r>
+      <w:r>
+        <w:rPr>
+          <w:sz w:val="28"/>
+          <w:szCs w:val="28"/>
+        </w:rPr>
+        <w:t>iện thoại:</w:t>
+      </w:r>
+      <w:r>
+        <w:rPr>
+          <w:sz w:val="28"/>
+          <w:szCs w:val="28"/>
+        </w:rPr>
+        <w:t xml:space="preserve"> 0889379022</w:t>
+      </w:r>
+      <w:r>
+        <w:rPr>
+          <w:sz w:val="28"/>
+          <w:szCs w:val="28"/>
+        </w:rPr>
+        <w:t xml:space="preserve"> </w:t>
+      </w:r>
+      <w:r>
+        <w:rPr>
+          <w:sz w:val="28"/>
+          <w:szCs w:val="28"/>
+        </w:rPr>
+        <w:tab/>
         <w:t xml:space="preserve">- </w:t>
       </w:r>
-      <w:proofErr w:type="spellStart"/>
-      <w:r>
-        <w:rPr>
-          <w:sz w:val="28"/>
-          <w:szCs w:val="28"/>
-        </w:rPr>
-        <w:t>Họ</w:t>
-      </w:r>
-      <w:proofErr w:type="spellEnd"/>
-      <w:r>
-        <w:rPr>
-          <w:sz w:val="28"/>
-          <w:szCs w:val="28"/>
-        </w:rPr>
-        <w:t xml:space="preserve"> </w:t>
-      </w:r>
-      <w:proofErr w:type="spellStart"/>
-      <w:r>
-        <w:rPr>
-          <w:sz w:val="28"/>
-          <w:szCs w:val="28"/>
-        </w:rPr>
-        <w:t>và</w:t>
-      </w:r>
-      <w:proofErr w:type="spellEnd"/>
-      <w:r>
-        <w:rPr>
-          <w:sz w:val="28"/>
-          <w:szCs w:val="28"/>
-        </w:rPr>
-        <w:t xml:space="preserve"> </w:t>
-      </w:r>
-      <w:proofErr w:type="spellStart"/>
-      <w:r>
-        <w:rPr>
-          <w:sz w:val="28"/>
-          <w:szCs w:val="28"/>
-        </w:rPr>
-        <w:t>tên</w:t>
-      </w:r>
-      <w:proofErr w:type="spellEnd"/>
-      <w:r>
-        <w:rPr>
-          <w:sz w:val="28"/>
-          <w:szCs w:val="28"/>
-        </w:rPr>
-        <w:t>:</w:t>
-      </w:r>
-      <w:r>
-        <w:rPr>
-          <w:sz w:val="28"/>
-          <w:szCs w:val="28"/>
-        </w:rPr>
-        <w:tab/>
-      </w:r>
-      <w:r>
-        <w:rPr>
-          <w:sz w:val="28"/>
-          <w:szCs w:val="28"/>
-        </w:rPr>
-        <w:t>Mai Ngọc Anh Đào</w:t>
-      </w:r>
-      <w:r>
-        <w:rPr>
-          <w:sz w:val="28"/>
-          <w:szCs w:val="28"/>
-        </w:rPr>
-        <w:tab/>
-      </w:r>
-      <w:r>
-        <w:rPr>
-          <w:sz w:val="28"/>
-          <w:szCs w:val="28"/>
-        </w:rPr>
-        <w:tab/>
-      </w:r>
-      <w:r>
-        <w:rPr>
-          <w:sz w:val="28"/>
-          <w:szCs w:val="28"/>
-        </w:rPr>
-        <w:tab/>
-      </w:r>
-      <w:r>
-        <w:rPr>
-          <w:sz w:val="28"/>
-          <w:szCs w:val="28"/>
-        </w:rPr>
-        <w:t xml:space="preserve">- </w:t>
-      </w:r>
-      <w:proofErr w:type="spellStart"/>
-      <w:r>
-        <w:rPr>
-          <w:sz w:val="28"/>
-          <w:szCs w:val="28"/>
-        </w:rPr>
-        <w:t>Giới</w:t>
-      </w:r>
-      <w:proofErr w:type="spellEnd"/>
-      <w:r>
-        <w:rPr>
-          <w:sz w:val="28"/>
-          <w:szCs w:val="28"/>
-        </w:rPr>
-        <w:t xml:space="preserve"> </w:t>
-      </w:r>
-      <w:proofErr w:type="spellStart"/>
-      <w:r>
-        <w:rPr>
-          <w:sz w:val="28"/>
-          <w:szCs w:val="28"/>
-        </w:rPr>
-        <w:t>tính</w:t>
-      </w:r>
-      <w:proofErr w:type="spellEnd"/>
-      <w:r>
-        <w:rPr>
-          <w:sz w:val="28"/>
-          <w:szCs w:val="28"/>
-        </w:rPr>
-        <w:t>:</w:t>
-      </w:r>
-      <w:r>
-        <w:rPr>
-          <w:sz w:val="28"/>
-          <w:szCs w:val="28"/>
-        </w:rPr>
-        <w:t xml:space="preserve"> </w:t>
-      </w:r>
-      <w:proofErr w:type="spellStart"/>
-      <w:r>
-        <w:rPr>
-          <w:sz w:val="28"/>
-          <w:szCs w:val="28"/>
-        </w:rPr>
-        <w:t>Nữ</w:t>
-      </w:r>
-      <w:proofErr w:type="spellEnd"/>
-    </w:p>
-    <w:p>
-      <w:pPr>
-        <w:spacing w:after="120" w:line="264" w:lineRule="auto"/>
-        <w:rPr>
-          <w:sz w:val="28"/>
-          <w:szCs w:val="28"/>
-        </w:rPr>
-      </w:pPr>
-      <w:r>
-        <w:rPr>
-          <w:sz w:val="28"/>
-          <w:szCs w:val="28"/>
-        </w:rPr>
-        <w:tab/>
-        <w:t>- Số CMND/CCCD:</w:t>
-      </w:r>
-      <w:r>
-        <w:rPr>
-          <w:sz w:val="28"/>
-          <w:szCs w:val="28"/>
-        </w:rPr>
-        <w:t xml:space="preserve"> 079305031638</w:t>
-      </w:r>
-      <w:r>
-        <w:rPr>
-          <w:sz w:val="28"/>
-          <w:szCs w:val="28"/>
-        </w:rPr>
-        <w:tab/>
-      </w:r>
-      <w:r>
-        <w:rPr>
-          <w:sz w:val="28"/>
-          <w:szCs w:val="28"/>
-        </w:rPr>
-        <w:tab/>
-      </w:r>
-      <w:r>
-        <w:rPr>
-          <w:sz w:val="28"/>
-          <w:szCs w:val="28"/>
-        </w:rPr>
-        <w:tab/>
-        <w:t xml:space="preserve">- </w:t>
-      </w:r>
-      <w:proofErr w:type="spellStart"/>
-      <w:r>
-        <w:rPr>
-          <w:sz w:val="28"/>
-          <w:szCs w:val="28"/>
-        </w:rPr>
-        <w:t>Năm</w:t>
-      </w:r>
-      <w:proofErr w:type="spellEnd"/>
-      <w:r>
-        <w:rPr>
-          <w:sz w:val="28"/>
-          <w:szCs w:val="28"/>
-        </w:rPr>
-        <w:t xml:space="preserve"> </w:t>
-      </w:r>
-      <w:proofErr w:type="spellStart"/>
-      <w:r>
-        <w:rPr>
-          <w:sz w:val="28"/>
-          <w:szCs w:val="28"/>
-        </w:rPr>
-        <w:t>sinh</w:t>
-      </w:r>
-      <w:proofErr w:type="spellEnd"/>
-      <w:r>
-        <w:rPr>
-          <w:sz w:val="28"/>
-          <w:szCs w:val="28"/>
-        </w:rPr>
-        <w:t>:</w:t>
-      </w:r>
-      <w:r>
-        <w:rPr>
-          <w:sz w:val="28"/>
-          <w:szCs w:val="28"/>
-        </w:rPr>
-        <w:t xml:space="preserve"> 2005</w:t>
-      </w:r>
-      <w:r>
-        <w:rPr>
-          <w:sz w:val="28"/>
-          <w:szCs w:val="28"/>
-        </w:rPr>
-        <w:tab/>
-      </w:r>
-    </w:p>
-    <w:p>
-      <w:pPr>
-        <w:spacing w:after="120" w:line="264" w:lineRule="auto"/>
-        <w:rPr>
-          <w:sz w:val="28"/>
-          <w:szCs w:val="28"/>
-        </w:rPr>
-      </w:pPr>
-      <w:r>
-        <w:rPr>
-          <w:sz w:val="28"/>
-          <w:szCs w:val="28"/>
-        </w:rPr>
-        <w:tab/>
-        <w:t xml:space="preserve">- </w:t>
-      </w:r>
-      <w:proofErr w:type="spellStart"/>
-      <w:r>
-        <w:rPr>
-          <w:sz w:val="28"/>
-          <w:szCs w:val="28"/>
-        </w:rPr>
-        <w:t>Trình</w:t>
-      </w:r>
-      <w:proofErr w:type="spellEnd"/>
-      <w:r>
-        <w:rPr>
-          <w:sz w:val="28"/>
-          <w:szCs w:val="28"/>
-        </w:rPr>
-        <w:t xml:space="preserve"> </w:t>
-      </w:r>
-      <w:proofErr w:type="spellStart"/>
-      <w:r>
-        <w:rPr>
-          <w:sz w:val="28"/>
-          <w:szCs w:val="28"/>
-        </w:rPr>
-        <w:t>độ</w:t>
-      </w:r>
-      <w:proofErr w:type="spellEnd"/>
-      <w:r>
-        <w:rPr>
-          <w:sz w:val="28"/>
-          <w:szCs w:val="28"/>
-        </w:rPr>
-        <w:t xml:space="preserve"> </w:t>
-      </w:r>
-      <w:proofErr w:type="spellStart"/>
-      <w:r>
-        <w:rPr>
-          <w:sz w:val="28"/>
-          <w:szCs w:val="28"/>
-        </w:rPr>
-        <w:t>học</w:t>
-      </w:r>
-      <w:proofErr w:type="spellEnd"/>
-      <w:r>
-        <w:rPr>
-          <w:sz w:val="28"/>
-          <w:szCs w:val="28"/>
-        </w:rPr>
-        <w:t xml:space="preserve"> </w:t>
-      </w:r>
-      <w:proofErr w:type="spellStart"/>
-      <w:r>
-        <w:rPr>
-          <w:sz w:val="28"/>
-          <w:szCs w:val="28"/>
-        </w:rPr>
-        <w:t>vấn</w:t>
-      </w:r>
-      <w:proofErr w:type="spellEnd"/>
-      <w:r>
-        <w:rPr>
-          <w:sz w:val="28"/>
-          <w:szCs w:val="28"/>
-        </w:rPr>
-        <w:t>/</w:t>
-      </w:r>
-      <w:proofErr w:type="spellStart"/>
-      <w:r>
-        <w:rPr>
-          <w:sz w:val="28"/>
-          <w:szCs w:val="28"/>
-        </w:rPr>
-        <w:t>chuyên</w:t>
-      </w:r>
-      <w:proofErr w:type="spellEnd"/>
-      <w:r>
-        <w:rPr>
-          <w:sz w:val="28"/>
-          <w:szCs w:val="28"/>
-        </w:rPr>
-        <w:t xml:space="preserve"> </w:t>
-      </w:r>
-      <w:proofErr w:type="spellStart"/>
-      <w:r>
-        <w:rPr>
-          <w:sz w:val="28"/>
-          <w:szCs w:val="28"/>
-        </w:rPr>
-        <w:t>môn</w:t>
-      </w:r>
-      <w:proofErr w:type="spellEnd"/>
-      <w:r>
-        <w:rPr>
-          <w:sz w:val="28"/>
-          <w:szCs w:val="28"/>
-        </w:rPr>
-        <w:t>:</w:t>
-      </w:r>
-      <w:r>
-        <w:rPr>
-          <w:sz w:val="28"/>
-          <w:szCs w:val="28"/>
-        </w:rPr>
-        <w:t xml:space="preserve"> </w:t>
-      </w:r>
-      <w:r>
-        <w:rPr>
-          <w:sz w:val="28"/>
-          <w:szCs w:val="28"/>
-        </w:rPr>
-        <w:t xml:space="preserve">Sinh </w:t>
-      </w:r>
-      <w:proofErr w:type="spellStart"/>
-      <w:r>
-        <w:rPr>
-          <w:sz w:val="28"/>
-          <w:szCs w:val="28"/>
-        </w:rPr>
-        <w:t>viên</w:t>
-      </w:r>
-      <w:proofErr w:type="spellEnd"/>
-      <w:r>
-        <w:rPr>
-          <w:sz w:val="28"/>
-          <w:szCs w:val="28"/>
-        </w:rPr>
-        <w:t xml:space="preserve"> </w:t>
-      </w:r>
-      <w:proofErr w:type="spellStart"/>
-      <w:r>
-        <w:rPr>
-          <w:sz w:val="28"/>
-          <w:szCs w:val="28"/>
-        </w:rPr>
-        <w:t>năm</w:t>
-      </w:r>
-      <w:proofErr w:type="spellEnd"/>
-      <w:r>
-        <w:rPr>
-          <w:sz w:val="28"/>
-          <w:szCs w:val="28"/>
-        </w:rPr>
-        <w:t xml:space="preserve"> 3 </w:t>
-      </w:r>
-      <w:proofErr w:type="spellStart"/>
-      <w:r>
-        <w:rPr>
-          <w:sz w:val="28"/>
-          <w:szCs w:val="28"/>
-        </w:rPr>
-        <w:t>ngành</w:t>
-      </w:r>
-      <w:proofErr w:type="spellEnd"/>
-      <w:r>
-        <w:rPr>
-          <w:sz w:val="28"/>
-          <w:szCs w:val="28"/>
-        </w:rPr>
-        <w:t xml:space="preserve"> Công </w:t>
-      </w:r>
-      <w:proofErr w:type="spellStart"/>
-      <w:r>
-        <w:rPr>
-          <w:sz w:val="28"/>
-          <w:szCs w:val="28"/>
-        </w:rPr>
-        <w:t>Nghệ</w:t>
-      </w:r>
-      <w:proofErr w:type="spellEnd"/>
-      <w:r>
-        <w:rPr>
-          <w:sz w:val="28"/>
-          <w:szCs w:val="28"/>
-        </w:rPr>
-        <w:t xml:space="preserve"> Thông Tin, Trường </w:t>
-      </w:r>
-      <w:proofErr w:type="spellStart"/>
-      <w:r>
-        <w:rPr>
-          <w:sz w:val="28"/>
-          <w:szCs w:val="28"/>
-        </w:rPr>
-        <w:t>Đại</w:t>
-      </w:r>
-      <w:proofErr w:type="spellEnd"/>
-      <w:r>
-        <w:rPr>
-          <w:sz w:val="28"/>
-          <w:szCs w:val="28"/>
-        </w:rPr>
-        <w:t xml:space="preserve"> </w:t>
-      </w:r>
-      <w:proofErr w:type="spellStart"/>
-      <w:r>
-        <w:rPr>
-          <w:sz w:val="28"/>
-          <w:szCs w:val="28"/>
-        </w:rPr>
-        <w:t>học</w:t>
-      </w:r>
-      <w:proofErr w:type="spellEnd"/>
-      <w:r>
-        <w:rPr>
-          <w:sz w:val="28"/>
-          <w:szCs w:val="28"/>
-        </w:rPr>
-        <w:t xml:space="preserve"> </w:t>
-      </w:r>
-      <w:proofErr w:type="spellStart"/>
-      <w:r>
-        <w:rPr>
-          <w:sz w:val="28"/>
-          <w:szCs w:val="28"/>
-        </w:rPr>
-        <w:t>Tiền</w:t>
-      </w:r>
-      <w:proofErr w:type="spellEnd"/>
-      <w:r>
-        <w:rPr>
-          <w:sz w:val="28"/>
-          <w:szCs w:val="28"/>
-        </w:rPr>
-        <w:t xml:space="preserve"> Giang.</w:t>
-      </w:r>
-    </w:p>
-    <w:p>
-      <w:pPr>
-        <w:spacing w:after="120" w:line="264" w:lineRule="auto"/>
-        <w:rPr>
-          <w:sz w:val="28"/>
-          <w:szCs w:val="28"/>
-        </w:rPr>
-      </w:pPr>
-      <w:r>
-        <w:rPr>
-          <w:sz w:val="28"/>
-          <w:szCs w:val="28"/>
-        </w:rPr>
-        <w:tab/>
-        <w:t xml:space="preserve">- </w:t>
-      </w:r>
-      <w:proofErr w:type="spellStart"/>
-      <w:r>
-        <w:rPr>
-          <w:sz w:val="28"/>
-          <w:szCs w:val="28"/>
-        </w:rPr>
-        <w:t>Số</w:t>
-      </w:r>
-      <w:proofErr w:type="spellEnd"/>
-      <w:r>
-        <w:rPr>
-          <w:sz w:val="28"/>
-          <w:szCs w:val="28"/>
-        </w:rPr>
-        <w:t xml:space="preserve"> </w:t>
-      </w:r>
-      <w:proofErr w:type="spellStart"/>
-      <w:r>
-        <w:rPr>
-          <w:sz w:val="28"/>
-          <w:szCs w:val="28"/>
-        </w:rPr>
-        <w:t>đ</w:t>
-      </w:r>
-      <w:r>
-        <w:rPr>
-          <w:sz w:val="28"/>
-          <w:szCs w:val="28"/>
-        </w:rPr>
-        <w:t>iện</w:t>
-      </w:r>
-      <w:proofErr w:type="spellEnd"/>
-      <w:r>
-        <w:rPr>
-          <w:sz w:val="28"/>
-          <w:szCs w:val="28"/>
-        </w:rPr>
-        <w:t xml:space="preserve"> </w:t>
-      </w:r>
-      <w:proofErr w:type="spellStart"/>
-      <w:r>
-        <w:rPr>
-          <w:sz w:val="28"/>
-          <w:szCs w:val="28"/>
-        </w:rPr>
-        <w:t>thoại</w:t>
-      </w:r>
-      <w:proofErr w:type="spellEnd"/>
-      <w:r>
-        <w:rPr>
-          <w:sz w:val="28"/>
-          <w:szCs w:val="28"/>
-        </w:rPr>
-        <w:t>:</w:t>
-      </w:r>
-      <w:r>
-        <w:rPr>
-          <w:sz w:val="28"/>
-          <w:szCs w:val="28"/>
-        </w:rPr>
-        <w:t xml:space="preserve"> 0889379022</w:t>
-      </w:r>
-      <w:r>
-        <w:rPr>
-          <w:sz w:val="28"/>
-          <w:szCs w:val="28"/>
-        </w:rPr>
-        <w:t xml:space="preserve"> </w:t>
-      </w:r>
-      <w:r>
-        <w:rPr>
-          <w:sz w:val="28"/>
-          <w:szCs w:val="28"/>
-        </w:rPr>
-        <w:tab/>
-        <w:t xml:space="preserve">- </w:t>
-      </w:r>
       <w:r>
         <w:rPr>
           <w:sz w:val="28"/>
@@ -2012,67 +1158,7 @@
           <w:sz w:val="28"/>
           <w:szCs w:val="28"/>
         </w:rPr>
-        <w:t xml:space="preserve">. Các </w:t>
-      </w:r>
-      <w:proofErr w:type="spellStart"/>
-      <w:r>
-        <w:rPr>
-          <w:b/>
-          <w:bCs/>
-          <w:sz w:val="28"/>
-          <w:szCs w:val="28"/>
-        </w:rPr>
-        <w:t>đồng</w:t>
-      </w:r>
-      <w:proofErr w:type="spellEnd"/>
-      <w:r>
-        <w:rPr>
-          <w:b/>
-          <w:bCs/>
-          <w:sz w:val="28"/>
-          <w:szCs w:val="28"/>
-        </w:rPr>
-        <w:t xml:space="preserve"> </w:t>
-      </w:r>
-      <w:proofErr w:type="spellStart"/>
-      <w:r>
-        <w:rPr>
-          <w:b/>
-          <w:bCs/>
-          <w:sz w:val="28"/>
-          <w:szCs w:val="28"/>
-        </w:rPr>
-        <w:t>sáng</w:t>
-      </w:r>
-      <w:proofErr w:type="spellEnd"/>
-      <w:r>
-        <w:rPr>
-          <w:b/>
-          <w:bCs/>
-          <w:sz w:val="28"/>
-          <w:szCs w:val="28"/>
-        </w:rPr>
-        <w:t xml:space="preserve"> </w:t>
-      </w:r>
-      <w:proofErr w:type="spellStart"/>
-      <w:r>
-        <w:rPr>
-          <w:b/>
-          <w:bCs/>
-          <w:sz w:val="28"/>
-          <w:szCs w:val="28"/>
-        </w:rPr>
-        <w:t>lập</w:t>
-      </w:r>
-      <w:proofErr w:type="spellEnd"/>
-      <w:r>
-        <w:rPr>
-          <w:b/>
-          <w:bCs/>
-          <w:sz w:val="28"/>
-          <w:szCs w:val="28"/>
-        </w:rPr>
-        <w:t xml:space="preserve"> </w:t>
+        <w:t xml:space="preserve">. Các đồng sáng lập </w:t>
       </w:r>
       <w:r>
         <w:rPr>
@@ -2083,9 +1169,261 @@
           <w:sz w:val="28"/>
           <w:szCs w:val="28"/>
         </w:rPr>
-        <w:t>(</w:t>
-      </w:r>
-      <w:proofErr w:type="spellStart"/>
+        <w:t>(nếu có)</w:t>
+      </w:r>
+      <w:r>
+        <w:rPr>
+          <w:b/>
+          <w:bCs/>
+          <w:sz w:val="28"/>
+          <w:szCs w:val="28"/>
+        </w:rPr>
+        <w:t>:</w:t>
+      </w:r>
+    </w:p>
+    <w:p>
+      <w:pPr>
+        <w:spacing w:after="120" w:line="264" w:lineRule="auto"/>
+        <w:rPr>
+          <w:sz w:val="28"/>
+          <w:szCs w:val="28"/>
+        </w:rPr>
+      </w:pPr>
+      <w:r>
+        <w:rPr>
+          <w:sz w:val="28"/>
+          <w:szCs w:val="28"/>
+        </w:rPr>
+        <w:tab/>
+        <w:t>- Họ và tên:</w:t>
+      </w:r>
+      <w:r>
+        <w:rPr>
+          <w:sz w:val="28"/>
+          <w:szCs w:val="28"/>
+        </w:rPr>
+        <w:tab/>
+        <w:t>Nguyễn Văn Trọng Phúc</w:t>
+      </w:r>
+      <w:r>
+        <w:rPr>
+          <w:sz w:val="28"/>
+          <w:szCs w:val="28"/>
+        </w:rPr>
+        <w:tab/>
+      </w:r>
+      <w:r>
+        <w:rPr>
+          <w:sz w:val="28"/>
+          <w:szCs w:val="28"/>
+        </w:rPr>
+        <w:tab/>
+      </w:r>
+      <w:r>
+        <w:rPr>
+          <w:sz w:val="28"/>
+          <w:szCs w:val="28"/>
+        </w:rPr>
+        <w:tab/>
+        <w:t>- Giới tính: Nam</w:t>
+      </w:r>
+    </w:p>
+    <w:p>
+      <w:pPr>
+        <w:spacing w:after="120" w:line="264" w:lineRule="auto"/>
+        <w:rPr>
+          <w:sz w:val="28"/>
+          <w:szCs w:val="28"/>
+        </w:rPr>
+      </w:pPr>
+      <w:r>
+        <w:rPr>
+          <w:sz w:val="28"/>
+          <w:szCs w:val="28"/>
+        </w:rPr>
+        <w:tab/>
+        <w:t xml:space="preserve">- Số CMND/CCCD: </w:t>
+      </w:r>
+      <w:r>
+        <w:rPr>
+          <w:sz w:val="28"/>
+          <w:szCs w:val="28"/>
+        </w:rPr>
+        <w:t>082205001048</w:t>
+      </w:r>
+      <w:r>
+        <w:rPr>
+          <w:sz w:val="28"/>
+          <w:szCs w:val="28"/>
+        </w:rPr>
+        <w:tab/>
+      </w:r>
+      <w:r>
+        <w:rPr>
+          <w:sz w:val="28"/>
+          <w:szCs w:val="28"/>
+        </w:rPr>
+        <w:tab/>
+      </w:r>
+      <w:r>
+        <w:rPr>
+          <w:sz w:val="28"/>
+          <w:szCs w:val="28"/>
+        </w:rPr>
+        <w:tab/>
+        <w:t>- Năm sinh: 2005</w:t>
+      </w:r>
+      <w:r>
+        <w:rPr>
+          <w:sz w:val="28"/>
+          <w:szCs w:val="28"/>
+        </w:rPr>
+        <w:tab/>
+      </w:r>
+    </w:p>
+    <w:p>
+      <w:pPr>
+        <w:spacing w:after="120" w:line="264" w:lineRule="auto"/>
+        <w:rPr>
+          <w:sz w:val="28"/>
+          <w:szCs w:val="28"/>
+        </w:rPr>
+      </w:pPr>
+      <w:r>
+        <w:rPr>
+          <w:sz w:val="28"/>
+          <w:szCs w:val="28"/>
+        </w:rPr>
+        <w:tab/>
+        <w:t>- Trình độ học vấn/chuyên môn:</w:t>
+      </w:r>
+      <w:r>
+        <w:rPr>
+          <w:sz w:val="28"/>
+          <w:szCs w:val="28"/>
+        </w:rPr>
+        <w:t xml:space="preserve"> </w:t>
+      </w:r>
+      <w:r>
+        <w:rPr>
+          <w:sz w:val="28"/>
+          <w:szCs w:val="28"/>
+        </w:rPr>
+        <w:t>Sinh viên năm 3 ngành Công Nghệ  Thông Tin, Trường Đại học Tiền Giang.</w:t>
+      </w:r>
+    </w:p>
+    <w:p>
+      <w:pPr>
+        <w:spacing w:after="120" w:line="264" w:lineRule="auto"/>
+        <w:rPr>
+          <w:sz w:val="28"/>
+          <w:szCs w:val="28"/>
+        </w:rPr>
+      </w:pPr>
+      <w:r>
+        <w:rPr>
+          <w:sz w:val="28"/>
+          <w:szCs w:val="28"/>
+        </w:rPr>
+        <w:tab/>
+        <w:t>- Số đ</w:t>
+      </w:r>
+      <w:r>
+        <w:rPr>
+          <w:sz w:val="28"/>
+          <w:szCs w:val="28"/>
+        </w:rPr>
+        <w:t>iện thoại:</w:t>
+      </w:r>
+      <w:r>
+        <w:rPr>
+          <w:sz w:val="28"/>
+          <w:szCs w:val="28"/>
+        </w:rPr>
+        <w:t xml:space="preserve"> 0362494496</w:t>
+      </w:r>
+      <w:r>
+        <w:rPr>
+          <w:sz w:val="28"/>
+          <w:szCs w:val="28"/>
+        </w:rPr>
+        <w:t xml:space="preserve"> </w:t>
+      </w:r>
+      <w:r>
+        <w:rPr>
+          <w:sz w:val="28"/>
+          <w:szCs w:val="28"/>
+        </w:rPr>
+        <w:tab/>
+        <w:t xml:space="preserve">- </w:t>
+      </w:r>
+      <w:r>
+        <w:rPr>
+          <w:sz w:val="28"/>
+          <w:szCs w:val="28"/>
+        </w:rPr>
+        <w:t xml:space="preserve">Email: </w:t>
+      </w:r>
+      <w:r>
+        <w:rPr>
+          <w:sz w:val="28"/>
+          <w:szCs w:val="28"/>
+        </w:rPr>
+        <w:t>phuc023101003</w:t>
+      </w:r>
+      <w:r>
+        <w:rPr>
+          <w:sz w:val="28"/>
+          <w:szCs w:val="28"/>
+        </w:rPr>
+        <w:t>@</w:t>
+      </w:r>
+      <w:r>
+        <w:rPr>
+          <w:sz w:val="28"/>
+          <w:szCs w:val="28"/>
+        </w:rPr>
+        <w:t>tgu.edu.vn</w:t>
+      </w:r>
+    </w:p>
+    <w:p>
+      <w:pPr>
+        <w:spacing w:after="120" w:line="264" w:lineRule="auto"/>
+        <w:rPr>
+          <w:sz w:val="28"/>
+          <w:szCs w:val="28"/>
+        </w:rPr>
+      </w:pPr>
+    </w:p>
+    <w:p>
+      <w:pPr>
+        <w:spacing w:after="120" w:line="264" w:lineRule="auto"/>
+        <w:rPr>
+          <w:b/>
+          <w:bCs/>
+          <w:sz w:val="28"/>
+          <w:szCs w:val="28"/>
+        </w:rPr>
+      </w:pPr>
+      <w:r>
+        <w:rPr>
+          <w:b/>
+          <w:bCs/>
+          <w:sz w:val="28"/>
+          <w:szCs w:val="28"/>
+        </w:rPr>
+        <w:lastRenderedPageBreak/>
+        <w:t>4</w:t>
+      </w:r>
+      <w:r>
+        <w:rPr>
+          <w:b/>
+          <w:bCs/>
+          <w:sz w:val="28"/>
+          <w:szCs w:val="28"/>
+        </w:rPr>
+        <w:t xml:space="preserve">. Các đồng sáng lập </w:t>
+      </w:r>
       <w:r>
         <w:rPr>
           <w:b/>
@@ -2095,48 +1433,270 @@
           <w:sz w:val="28"/>
           <w:szCs w:val="28"/>
         </w:rPr>
-        <w:t>nếu</w:t>
-      </w:r>
-      <w:proofErr w:type="spellEnd"/>
+        <w:t>(nếu có)</w:t>
+      </w:r>
       <w:r>
         <w:rPr>
           <w:b/>
           <w:bCs/>
-          <w:i/>
-          <w:iCs/>
+          <w:sz w:val="28"/>
+          <w:szCs w:val="28"/>
+        </w:rPr>
+        <w:t>:</w:t>
+      </w:r>
+    </w:p>
+    <w:p>
+      <w:pPr>
+        <w:spacing w:after="120" w:line="264" w:lineRule="auto"/>
+        <w:rPr>
+          <w:sz w:val="28"/>
+          <w:szCs w:val="28"/>
+        </w:rPr>
+      </w:pPr>
+      <w:r>
+        <w:rPr>
+          <w:sz w:val="28"/>
+          <w:szCs w:val="28"/>
+        </w:rPr>
+        <w:tab/>
+        <w:t>- Họ và tên:</w:t>
+      </w:r>
+      <w:r>
+        <w:rPr>
+          <w:sz w:val="28"/>
+          <w:szCs w:val="28"/>
+        </w:rPr>
+        <w:tab/>
+        <w:t>Nguyễn Văn Trọng Phúc</w:t>
+      </w:r>
+      <w:r>
+        <w:rPr>
+          <w:sz w:val="28"/>
+          <w:szCs w:val="28"/>
+        </w:rPr>
+        <w:tab/>
+      </w:r>
+      <w:r>
+        <w:rPr>
+          <w:sz w:val="28"/>
+          <w:szCs w:val="28"/>
+        </w:rPr>
+        <w:tab/>
+      </w:r>
+      <w:r>
+        <w:rPr>
+          <w:sz w:val="28"/>
+          <w:szCs w:val="28"/>
+        </w:rPr>
+        <w:tab/>
+        <w:t>- Giới tính: Nam</w:t>
+      </w:r>
+    </w:p>
+    <w:p>
+      <w:pPr>
+        <w:spacing w:after="120" w:line="264" w:lineRule="auto"/>
+        <w:rPr>
+          <w:sz w:val="28"/>
+          <w:szCs w:val="28"/>
+        </w:rPr>
+      </w:pPr>
+      <w:r>
+        <w:rPr>
+          <w:sz w:val="28"/>
+          <w:szCs w:val="28"/>
+        </w:rPr>
+        <w:tab/>
+        <w:t>- Số CMND/CCCD: 082205001048</w:t>
+      </w:r>
+      <w:r>
+        <w:rPr>
+          <w:sz w:val="28"/>
+          <w:szCs w:val="28"/>
+        </w:rPr>
+        <w:tab/>
+      </w:r>
+      <w:r>
+        <w:rPr>
+          <w:sz w:val="28"/>
+          <w:szCs w:val="28"/>
+        </w:rPr>
+        <w:tab/>
+      </w:r>
+      <w:r>
+        <w:rPr>
+          <w:sz w:val="28"/>
+          <w:szCs w:val="28"/>
+        </w:rPr>
+        <w:tab/>
+        <w:t>- Năm sinh: 2005</w:t>
+      </w:r>
+      <w:r>
+        <w:rPr>
+          <w:sz w:val="28"/>
+          <w:szCs w:val="28"/>
+        </w:rPr>
+        <w:tab/>
+      </w:r>
+    </w:p>
+    <w:p>
+      <w:pPr>
+        <w:spacing w:after="120" w:line="264" w:lineRule="auto"/>
+        <w:rPr>
+          <w:sz w:val="28"/>
+          <w:szCs w:val="28"/>
+        </w:rPr>
+      </w:pPr>
+      <w:r>
+        <w:rPr>
+          <w:sz w:val="28"/>
+          <w:szCs w:val="28"/>
+        </w:rPr>
+        <w:tab/>
+        <w:t xml:space="preserve">- Trình độ học vấn/chuyên môn: </w:t>
+      </w:r>
+      <w:r>
+        <w:rPr>
+          <w:sz w:val="28"/>
+          <w:szCs w:val="28"/>
+        </w:rPr>
+        <w:t>Sinh viên năm 3 ngành Công Nghệ  Thông Tin, Trường Đại học Tiền Giang.</w:t>
+      </w:r>
+    </w:p>
+    <w:p>
+      <w:pPr>
+        <w:spacing w:after="120" w:line="264" w:lineRule="auto"/>
+        <w:rPr>
+          <w:sz w:val="28"/>
+          <w:szCs w:val="28"/>
+        </w:rPr>
+      </w:pPr>
+      <w:r>
+        <w:rPr>
+          <w:sz w:val="28"/>
+          <w:szCs w:val="28"/>
+        </w:rPr>
+        <w:tab/>
+        <w:t>- Số đ</w:t>
+      </w:r>
+      <w:r>
+        <w:rPr>
+          <w:sz w:val="28"/>
+          <w:szCs w:val="28"/>
+        </w:rPr>
+        <w:t>iện thoại:</w:t>
+      </w:r>
+      <w:r>
+        <w:rPr>
+          <w:sz w:val="28"/>
+          <w:szCs w:val="28"/>
+        </w:rPr>
+        <w:t xml:space="preserve"> 0362494496</w:t>
+      </w:r>
+      <w:r>
+        <w:rPr>
           <w:sz w:val="28"/>
           <w:szCs w:val="28"/>
         </w:rPr>
         <w:t xml:space="preserve"> </w:t>
       </w:r>
-      <w:proofErr w:type="spellStart"/>
-      <w:r>
-        <w:rPr>
-          <w:b/>
-          <w:bCs/>
-          <w:i/>
-          <w:iCs/>
-          <w:sz w:val="28"/>
-          <w:szCs w:val="28"/>
-        </w:rPr>
-        <w:t>có</w:t>
-      </w:r>
-      <w:proofErr w:type="spellEnd"/>
-      <w:r>
-        <w:rPr>
-          <w:b/>
-          <w:bCs/>
-          <w:i/>
-          <w:iCs/>
-          <w:sz w:val="28"/>
-          <w:szCs w:val="28"/>
-        </w:rPr>
-        <w:t>)</w:t>
-      </w:r>
-      <w:r>
-        <w:rPr>
-          <w:b/>
-          <w:bCs/>
+      <w:r>
+        <w:rPr>
+          <w:sz w:val="28"/>
+          <w:szCs w:val="28"/>
+        </w:rPr>
+        <w:tab/>
+        <w:t xml:space="preserve">- </w:t>
+      </w:r>
+      <w:r>
+        <w:rPr>
+          <w:sz w:val="28"/>
+          <w:szCs w:val="28"/>
+        </w:rPr>
+        <w:t xml:space="preserve">Email: </w:t>
+      </w:r>
+      <w:r>
+        <w:rPr>
+          <w:sz w:val="28"/>
+          <w:szCs w:val="28"/>
+        </w:rPr>
+        <w:t>phuc023101003@@tgu.edu.vn</w:t>
+      </w:r>
+    </w:p>
+    <w:p>
+      <w:pPr>
+        <w:spacing w:after="120" w:line="264" w:lineRule="auto"/>
+        <w:ind w:firstLine="720"/>
+        <w:rPr>
+          <w:sz w:val="28"/>
+          <w:szCs w:val="28"/>
+        </w:rPr>
+      </w:pPr>
+    </w:p>
+    <w:p>
+      <w:pPr>
+        <w:spacing w:after="120" w:line="264" w:lineRule="auto"/>
+        <w:ind w:firstLine="720"/>
+        <w:rPr>
+          <w:sz w:val="28"/>
+          <w:szCs w:val="28"/>
+        </w:rPr>
+      </w:pPr>
+    </w:p>
+    <w:p>
+      <w:pPr>
+        <w:spacing w:after="120" w:line="264" w:lineRule="auto"/>
+        <w:ind w:firstLine="720"/>
+        <w:rPr>
+          <w:sz w:val="28"/>
+          <w:szCs w:val="28"/>
+        </w:rPr>
+      </w:pPr>
+    </w:p>
+    <w:p>
+      <w:pPr>
+        <w:spacing w:after="120" w:line="264" w:lineRule="auto"/>
+        <w:jc w:val="both"/>
+        <w:rPr>
+          <w:b/>
+          <w:sz w:val="28"/>
+          <w:szCs w:val="28"/>
+        </w:rPr>
+      </w:pPr>
+      <w:r>
+        <w:rPr>
+          <w:b/>
+          <w:sz w:val="28"/>
+          <w:szCs w:val="28"/>
+        </w:rPr>
+        <w:t>I</w:t>
+      </w:r>
+      <w:r>
+        <w:rPr>
+          <w:b/>
+          <w:sz w:val="28"/>
+          <w:szCs w:val="28"/>
+        </w:rPr>
+        <w:t>I</w:t>
+      </w:r>
+      <w:r>
+        <w:rPr>
+          <w:b/>
+          <w:sz w:val="28"/>
+          <w:szCs w:val="28"/>
+        </w:rPr>
+        <w:t xml:space="preserve">. </w:t>
+      </w:r>
+      <w:r>
+        <w:rPr>
+          <w:b/>
+          <w:sz w:val="28"/>
+          <w:szCs w:val="28"/>
+        </w:rPr>
+        <w:t>THÔNG TIN DỰ ÁN</w:t>
+      </w:r>
+      <w:r>
+        <w:rPr>
+          <w:b/>
           <w:sz w:val="28"/>
           <w:szCs w:val="28"/>
         </w:rPr>
@@ -2153,21 +1713,45 @@
       </w:pPr>
       <w:r>
         <w:rPr>
-          <w:sz w:val="28"/>
-          <w:szCs w:val="28"/>
-        </w:rPr>
-        <w:tab/>
-        <w:t xml:space="preserve">- </w:t>
-      </w:r>
-      <w:proofErr w:type="spellStart"/>
-      <w:r>
-        <w:rPr>
-          <w:sz w:val="28"/>
-          <w:szCs w:val="28"/>
-        </w:rPr>
-        <w:t>Họ</w:t>
-      </w:r>
-      <w:proofErr w:type="spellEnd"/>
+          <w:b/>
+          <w:sz w:val="28"/>
+          <w:szCs w:val="28"/>
+          <w:lang w:val="vi-VN"/>
+        </w:rPr>
+        <w:t xml:space="preserve">1. </w:t>
+      </w:r>
+      <w:r>
+        <w:rPr>
+          <w:b/>
+          <w:sz w:val="28"/>
+          <w:szCs w:val="28"/>
+        </w:rPr>
+        <w:t xml:space="preserve">Tên </w:t>
+      </w:r>
+      <w:r>
+        <w:rPr>
+          <w:b/>
+          <w:sz w:val="28"/>
+          <w:szCs w:val="28"/>
+        </w:rPr>
+        <w:t>dự</w:t>
+      </w:r>
+      <w:r>
+        <w:rPr>
+          <w:b/>
+          <w:sz w:val="28"/>
+          <w:szCs w:val="28"/>
+        </w:rPr>
+        <w:t xml:space="preserve"> án</w:t>
+      </w:r>
+      <w:r>
+        <w:rPr>
+          <w:b/>
+          <w:sz w:val="28"/>
+          <w:szCs w:val="28"/>
+        </w:rPr>
+        <w:t>:</w:t>
+      </w:r>
       <w:r>
         <w:rPr>
           <w:sz w:val="28"/>
@@ -2175,918 +1759,13 @@
         </w:rPr>
         <w:t xml:space="preserve"> </w:t>
       </w:r>
-      <w:proofErr w:type="spellStart"/>
-      <w:r>
-        <w:rPr>
-          <w:sz w:val="28"/>
-          <w:szCs w:val="28"/>
-        </w:rPr>
-        <w:t>và</w:t>
-      </w:r>
-      <w:proofErr w:type="spellEnd"/>
-      <w:r>
-        <w:rPr>
-          <w:sz w:val="28"/>
-          <w:szCs w:val="28"/>
-        </w:rPr>
-        <w:t xml:space="preserve"> </w:t>
-      </w:r>
-      <w:proofErr w:type="spellStart"/>
-      <w:r>
-        <w:rPr>
-          <w:sz w:val="28"/>
-          <w:szCs w:val="28"/>
-        </w:rPr>
-        <w:t>tên</w:t>
-      </w:r>
-      <w:proofErr w:type="spellEnd"/>
-      <w:r>
-        <w:rPr>
-          <w:sz w:val="28"/>
-          <w:szCs w:val="28"/>
-        </w:rPr>
-        <w:t>:</w:t>
-      </w:r>
-      <w:r>
-        <w:rPr>
-          <w:sz w:val="28"/>
-          <w:szCs w:val="28"/>
-        </w:rPr>
-        <w:tab/>
-        <w:t>Nguyễn Văn Trọng Phúc</w:t>
-      </w:r>
-      <w:r>
-        <w:rPr>
-          <w:sz w:val="28"/>
-          <w:szCs w:val="28"/>
-        </w:rPr>
-        <w:tab/>
-      </w:r>
-      <w:r>
-        <w:rPr>
-          <w:sz w:val="28"/>
-          <w:szCs w:val="28"/>
-        </w:rPr>
-        <w:tab/>
-      </w:r>
-      <w:r>
-        <w:rPr>
-          <w:sz w:val="28"/>
-          <w:szCs w:val="28"/>
-        </w:rPr>
-        <w:tab/>
-        <w:t xml:space="preserve">- </w:t>
-      </w:r>
-      <w:proofErr w:type="spellStart"/>
-      <w:r>
-        <w:rPr>
-          <w:sz w:val="28"/>
-          <w:szCs w:val="28"/>
-        </w:rPr>
-        <w:t>Giới</w:t>
-      </w:r>
-      <w:proofErr w:type="spellEnd"/>
-      <w:r>
-        <w:rPr>
-          <w:sz w:val="28"/>
-          <w:szCs w:val="28"/>
-        </w:rPr>
-        <w:t xml:space="preserve"> </w:t>
-      </w:r>
-      <w:proofErr w:type="spellStart"/>
-      <w:r>
-        <w:rPr>
-          <w:sz w:val="28"/>
-          <w:szCs w:val="28"/>
-        </w:rPr>
-        <w:t>tính</w:t>
-      </w:r>
-      <w:proofErr w:type="spellEnd"/>
-      <w:r>
-        <w:rPr>
-          <w:sz w:val="28"/>
-          <w:szCs w:val="28"/>
-        </w:rPr>
-        <w:t>: Nam</w:t>
-      </w:r>
-    </w:p>
-    <w:p>
-      <w:pPr>
-        <w:spacing w:after="120" w:line="264" w:lineRule="auto"/>
-        <w:rPr>
-          <w:sz w:val="28"/>
-          <w:szCs w:val="28"/>
-        </w:rPr>
-      </w:pPr>
-      <w:r>
-        <w:rPr>
-          <w:sz w:val="28"/>
-          <w:szCs w:val="28"/>
-        </w:rPr>
-        <w:tab/>
-        <w:t xml:space="preserve">- </w:t>
-      </w:r>
-      <w:proofErr w:type="spellStart"/>
-      <w:r>
-        <w:rPr>
-          <w:sz w:val="28"/>
-          <w:szCs w:val="28"/>
-        </w:rPr>
-        <w:t>Số</w:t>
-      </w:r>
-      <w:proofErr w:type="spellEnd"/>
-      <w:r>
-        <w:rPr>
-          <w:sz w:val="28"/>
-          <w:szCs w:val="28"/>
-        </w:rPr>
-        <w:t xml:space="preserve"> CMND/CCCD: </w:t>
-      </w:r>
-      <w:r>
-        <w:rPr>
-          <w:sz w:val="28"/>
-          <w:szCs w:val="28"/>
-        </w:rPr>
-        <w:t>082205001048</w:t>
-      </w:r>
-      <w:r>
-        <w:rPr>
-          <w:sz w:val="28"/>
-          <w:szCs w:val="28"/>
-        </w:rPr>
-        <w:tab/>
-      </w:r>
-      <w:r>
-        <w:rPr>
-          <w:sz w:val="28"/>
-          <w:szCs w:val="28"/>
-        </w:rPr>
-        <w:tab/>
-      </w:r>
-      <w:r>
-        <w:rPr>
-          <w:sz w:val="28"/>
-          <w:szCs w:val="28"/>
-        </w:rPr>
-        <w:tab/>
-        <w:t xml:space="preserve">- </w:t>
-      </w:r>
-      <w:proofErr w:type="spellStart"/>
-      <w:r>
-        <w:rPr>
-          <w:sz w:val="28"/>
-          <w:szCs w:val="28"/>
-        </w:rPr>
-        <w:t>Năm</w:t>
-      </w:r>
-      <w:proofErr w:type="spellEnd"/>
-      <w:r>
-        <w:rPr>
-          <w:sz w:val="28"/>
-          <w:szCs w:val="28"/>
-        </w:rPr>
-        <w:t xml:space="preserve"> </w:t>
-      </w:r>
-      <w:proofErr w:type="spellStart"/>
-      <w:r>
-        <w:rPr>
-          <w:sz w:val="28"/>
-          <w:szCs w:val="28"/>
-        </w:rPr>
-        <w:t>sinh</w:t>
-      </w:r>
-      <w:proofErr w:type="spellEnd"/>
-      <w:r>
-        <w:rPr>
-          <w:sz w:val="28"/>
-          <w:szCs w:val="28"/>
-        </w:rPr>
-        <w:t>: 2005</w:t>
-      </w:r>
-      <w:r>
-        <w:rPr>
-          <w:sz w:val="28"/>
-          <w:szCs w:val="28"/>
-        </w:rPr>
-        <w:tab/>
-      </w:r>
-    </w:p>
-    <w:p>
-      <w:pPr>
-        <w:spacing w:after="120" w:line="264" w:lineRule="auto"/>
-        <w:rPr>
-          <w:sz w:val="28"/>
-          <w:szCs w:val="28"/>
-        </w:rPr>
-      </w:pPr>
-      <w:r>
-        <w:rPr>
-          <w:sz w:val="28"/>
-          <w:szCs w:val="28"/>
-        </w:rPr>
-        <w:tab/>
-        <w:t xml:space="preserve">- </w:t>
-      </w:r>
-      <w:proofErr w:type="spellStart"/>
-      <w:r>
-        <w:rPr>
-          <w:sz w:val="28"/>
-          <w:szCs w:val="28"/>
-        </w:rPr>
-        <w:t>Trình</w:t>
-      </w:r>
-      <w:proofErr w:type="spellEnd"/>
-      <w:r>
-        <w:rPr>
-          <w:sz w:val="28"/>
-          <w:szCs w:val="28"/>
-        </w:rPr>
-        <w:t xml:space="preserve"> </w:t>
-      </w:r>
-      <w:proofErr w:type="spellStart"/>
-      <w:r>
-        <w:rPr>
-          <w:sz w:val="28"/>
-          <w:szCs w:val="28"/>
-        </w:rPr>
-        <w:t>độ</w:t>
-      </w:r>
-      <w:proofErr w:type="spellEnd"/>
-      <w:r>
-        <w:rPr>
-          <w:sz w:val="28"/>
-          <w:szCs w:val="28"/>
-        </w:rPr>
-        <w:t xml:space="preserve"> </w:t>
-      </w:r>
-      <w:proofErr w:type="spellStart"/>
-      <w:r>
-        <w:rPr>
-          <w:sz w:val="28"/>
-          <w:szCs w:val="28"/>
-        </w:rPr>
-        <w:t>học</w:t>
-      </w:r>
-      <w:proofErr w:type="spellEnd"/>
-      <w:r>
-        <w:rPr>
-          <w:sz w:val="28"/>
-          <w:szCs w:val="28"/>
-        </w:rPr>
-        <w:t xml:space="preserve"> </w:t>
-      </w:r>
-      <w:proofErr w:type="spellStart"/>
-      <w:r>
-        <w:rPr>
-          <w:sz w:val="28"/>
-          <w:szCs w:val="28"/>
-        </w:rPr>
-        <w:t>vấn</w:t>
-      </w:r>
-      <w:proofErr w:type="spellEnd"/>
-      <w:r>
-        <w:rPr>
-          <w:sz w:val="28"/>
-          <w:szCs w:val="28"/>
-        </w:rPr>
-        <w:t>/</w:t>
-      </w:r>
-      <w:proofErr w:type="spellStart"/>
-      <w:r>
-        <w:rPr>
-          <w:sz w:val="28"/>
-          <w:szCs w:val="28"/>
-        </w:rPr>
-        <w:t>chuyên</w:t>
-      </w:r>
-      <w:proofErr w:type="spellEnd"/>
-      <w:r>
-        <w:rPr>
-          <w:sz w:val="28"/>
-          <w:szCs w:val="28"/>
-        </w:rPr>
-        <w:t xml:space="preserve"> </w:t>
-      </w:r>
-      <w:proofErr w:type="spellStart"/>
-      <w:r>
-        <w:rPr>
-          <w:sz w:val="28"/>
-          <w:szCs w:val="28"/>
-        </w:rPr>
-        <w:t>môn</w:t>
-      </w:r>
-      <w:proofErr w:type="spellEnd"/>
-      <w:r>
-        <w:rPr>
-          <w:sz w:val="28"/>
-          <w:szCs w:val="28"/>
-        </w:rPr>
-        <w:t>:</w:t>
-      </w:r>
-      <w:r>
-        <w:rPr>
-          <w:sz w:val="28"/>
-          <w:szCs w:val="28"/>
-        </w:rPr>
-        <w:t xml:space="preserve"> </w:t>
-      </w:r>
-      <w:r>
-        <w:rPr>
-          <w:sz w:val="28"/>
-          <w:szCs w:val="28"/>
-        </w:rPr>
-        <w:t xml:space="preserve">Sinh </w:t>
-      </w:r>
-      <w:proofErr w:type="spellStart"/>
-      <w:r>
-        <w:rPr>
-          <w:sz w:val="28"/>
-          <w:szCs w:val="28"/>
-        </w:rPr>
-        <w:t>viên</w:t>
-      </w:r>
-      <w:proofErr w:type="spellEnd"/>
-      <w:r>
-        <w:rPr>
-          <w:sz w:val="28"/>
-          <w:szCs w:val="28"/>
-        </w:rPr>
-        <w:t xml:space="preserve"> </w:t>
-      </w:r>
-      <w:proofErr w:type="spellStart"/>
-      <w:r>
-        <w:rPr>
-          <w:sz w:val="28"/>
-          <w:szCs w:val="28"/>
-        </w:rPr>
-        <w:t>năm</w:t>
-      </w:r>
-      <w:proofErr w:type="spellEnd"/>
-      <w:r>
-        <w:rPr>
-          <w:sz w:val="28"/>
-          <w:szCs w:val="28"/>
-        </w:rPr>
-        <w:t xml:space="preserve"> 3 </w:t>
-      </w:r>
-      <w:proofErr w:type="spellStart"/>
-      <w:r>
-        <w:rPr>
-          <w:sz w:val="28"/>
-          <w:szCs w:val="28"/>
-        </w:rPr>
-        <w:t>ngành</w:t>
-      </w:r>
-      <w:proofErr w:type="spellEnd"/>
-      <w:r>
-        <w:rPr>
-          <w:sz w:val="28"/>
-          <w:szCs w:val="28"/>
-        </w:rPr>
-        <w:t xml:space="preserve"> Công </w:t>
-      </w:r>
-      <w:proofErr w:type="spellStart"/>
-      <w:proofErr w:type="gramStart"/>
-      <w:r>
-        <w:rPr>
-          <w:sz w:val="28"/>
-          <w:szCs w:val="28"/>
-        </w:rPr>
-        <w:t>Nghệ</w:t>
-      </w:r>
-      <w:proofErr w:type="spellEnd"/>
-      <w:r>
-        <w:rPr>
-          <w:sz w:val="28"/>
-          <w:szCs w:val="28"/>
-        </w:rPr>
-        <w:t xml:space="preserve">  Thông</w:t>
-      </w:r>
-      <w:proofErr w:type="gramEnd"/>
-      <w:r>
-        <w:rPr>
-          <w:sz w:val="28"/>
-          <w:szCs w:val="28"/>
-        </w:rPr>
-        <w:t xml:space="preserve"> Tin, Trường </w:t>
-      </w:r>
-      <w:proofErr w:type="spellStart"/>
-      <w:r>
-        <w:rPr>
-          <w:sz w:val="28"/>
-          <w:szCs w:val="28"/>
-        </w:rPr>
-        <w:t>Đại</w:t>
-      </w:r>
-      <w:proofErr w:type="spellEnd"/>
-      <w:r>
-        <w:rPr>
-          <w:sz w:val="28"/>
-          <w:szCs w:val="28"/>
-        </w:rPr>
-        <w:t xml:space="preserve"> </w:t>
-      </w:r>
-      <w:proofErr w:type="spellStart"/>
-      <w:r>
-        <w:rPr>
-          <w:sz w:val="28"/>
-          <w:szCs w:val="28"/>
-        </w:rPr>
-        <w:t>học</w:t>
-      </w:r>
-      <w:proofErr w:type="spellEnd"/>
-      <w:r>
-        <w:rPr>
-          <w:sz w:val="28"/>
-          <w:szCs w:val="28"/>
-        </w:rPr>
-        <w:t xml:space="preserve"> </w:t>
-      </w:r>
-      <w:proofErr w:type="spellStart"/>
-      <w:r>
-        <w:rPr>
-          <w:sz w:val="28"/>
-          <w:szCs w:val="28"/>
-        </w:rPr>
-        <w:t>Tiền</w:t>
-      </w:r>
-      <w:proofErr w:type="spellEnd"/>
-      <w:r>
-        <w:rPr>
-          <w:sz w:val="28"/>
-          <w:szCs w:val="28"/>
-        </w:rPr>
-        <w:t xml:space="preserve"> Giang.</w:t>
-      </w:r>
-    </w:p>
-    <w:p>
-      <w:pPr>
-        <w:spacing w:after="120" w:line="264" w:lineRule="auto"/>
-        <w:rPr>
-          <w:sz w:val="28"/>
-          <w:szCs w:val="28"/>
-        </w:rPr>
-      </w:pPr>
-      <w:r>
-        <w:rPr>
-          <w:sz w:val="28"/>
-          <w:szCs w:val="28"/>
-        </w:rPr>
-        <w:tab/>
-        <w:t xml:space="preserve">- </w:t>
-      </w:r>
-      <w:proofErr w:type="spellStart"/>
-      <w:r>
-        <w:rPr>
-          <w:sz w:val="28"/>
-          <w:szCs w:val="28"/>
-        </w:rPr>
-        <w:t>Số</w:t>
-      </w:r>
-      <w:proofErr w:type="spellEnd"/>
-      <w:r>
-        <w:rPr>
-          <w:sz w:val="28"/>
-          <w:szCs w:val="28"/>
-        </w:rPr>
-        <w:t xml:space="preserve"> </w:t>
-      </w:r>
-      <w:proofErr w:type="spellStart"/>
-      <w:r>
-        <w:rPr>
-          <w:sz w:val="28"/>
-          <w:szCs w:val="28"/>
-        </w:rPr>
-        <w:t>đ</w:t>
-      </w:r>
-      <w:r>
-        <w:rPr>
-          <w:sz w:val="28"/>
-          <w:szCs w:val="28"/>
-        </w:rPr>
-        <w:t>iện</w:t>
-      </w:r>
-      <w:proofErr w:type="spellEnd"/>
-      <w:r>
-        <w:rPr>
-          <w:sz w:val="28"/>
-          <w:szCs w:val="28"/>
-        </w:rPr>
-        <w:t xml:space="preserve"> </w:t>
-      </w:r>
-      <w:proofErr w:type="spellStart"/>
-      <w:r>
-        <w:rPr>
-          <w:sz w:val="28"/>
-          <w:szCs w:val="28"/>
-        </w:rPr>
-        <w:t>thoại</w:t>
-      </w:r>
-      <w:proofErr w:type="spellEnd"/>
-      <w:r>
-        <w:rPr>
-          <w:sz w:val="28"/>
-          <w:szCs w:val="28"/>
-        </w:rPr>
-        <w:t>:</w:t>
-      </w:r>
-      <w:r>
-        <w:rPr>
-          <w:sz w:val="28"/>
-          <w:szCs w:val="28"/>
-        </w:rPr>
-        <w:t xml:space="preserve"> 0362494496</w:t>
-      </w:r>
-      <w:r>
-        <w:rPr>
-          <w:sz w:val="28"/>
-          <w:szCs w:val="28"/>
-        </w:rPr>
-        <w:t xml:space="preserve"> </w:t>
-      </w:r>
-      <w:r>
-        <w:rPr>
-          <w:sz w:val="28"/>
-          <w:szCs w:val="28"/>
-        </w:rPr>
-        <w:tab/>
-        <w:t xml:space="preserve">- </w:t>
-      </w:r>
-      <w:r>
-        <w:rPr>
-          <w:sz w:val="28"/>
-          <w:szCs w:val="28"/>
-        </w:rPr>
-        <w:t xml:space="preserve">Email: </w:t>
-      </w:r>
-      <w:r>
-        <w:rPr>
-          <w:sz w:val="28"/>
-          <w:szCs w:val="28"/>
-        </w:rPr>
-        <w:t>phuc023101003@@tgu.edu.vn</w:t>
-      </w:r>
-    </w:p>
-    <w:p>
-      <w:pPr>
-        <w:spacing w:after="120" w:line="264" w:lineRule="auto"/>
-        <w:ind w:firstLine="720"/>
-        <w:rPr>
-          <w:sz w:val="28"/>
-          <w:szCs w:val="28"/>
-        </w:rPr>
-      </w:pPr>
-    </w:p>
-    <w:p>
-      <w:pPr>
-        <w:spacing w:after="120" w:line="264" w:lineRule="auto"/>
-        <w:ind w:firstLine="720"/>
-        <w:rPr>
-          <w:sz w:val="28"/>
-          <w:szCs w:val="28"/>
-        </w:rPr>
-      </w:pPr>
-    </w:p>
-    <w:p>
-      <w:pPr>
-        <w:spacing w:after="120" w:line="264" w:lineRule="auto"/>
-        <w:ind w:firstLine="720"/>
-        <w:rPr>
-          <w:sz w:val="28"/>
-          <w:szCs w:val="28"/>
-        </w:rPr>
-      </w:pPr>
-    </w:p>
-    <w:p>
-      <w:pPr>
-        <w:spacing w:after="120" w:line="264" w:lineRule="auto"/>
-        <w:jc w:val="both"/>
-        <w:rPr>
-          <w:b/>
-          <w:sz w:val="28"/>
-          <w:szCs w:val="28"/>
-        </w:rPr>
-      </w:pPr>
-      <w:r>
-        <w:rPr>
-          <w:b/>
-          <w:sz w:val="28"/>
-          <w:szCs w:val="28"/>
-        </w:rPr>
-        <w:t>I</w:t>
-      </w:r>
-      <w:r>
-        <w:rPr>
-          <w:b/>
-          <w:sz w:val="28"/>
-          <w:szCs w:val="28"/>
-        </w:rPr>
-        <w:t>I</w:t>
-      </w:r>
-      <w:r>
-        <w:rPr>
-          <w:b/>
-          <w:sz w:val="28"/>
-          <w:szCs w:val="28"/>
-        </w:rPr>
-        <w:t xml:space="preserve">. </w:t>
-      </w:r>
-      <w:r>
-        <w:rPr>
-          <w:b/>
-          <w:sz w:val="28"/>
-          <w:szCs w:val="28"/>
-        </w:rPr>
-        <w:t>THÔNG TIN DỰ ÁN</w:t>
-      </w:r>
-      <w:r>
-        <w:rPr>
-          <w:b/>
-          <w:sz w:val="28"/>
-          <w:szCs w:val="28"/>
-        </w:rPr>
-        <w:t>:</w:t>
-      </w:r>
-    </w:p>
-    <w:p>
-      <w:pPr>
-        <w:spacing w:after="120" w:line="264" w:lineRule="auto"/>
-        <w:rPr>
-          <w:sz w:val="28"/>
-          <w:szCs w:val="28"/>
-        </w:rPr>
-      </w:pPr>
-      <w:r>
-        <w:rPr>
-          <w:b/>
-          <w:sz w:val="28"/>
-          <w:szCs w:val="28"/>
-          <w:lang w:val="vi-VN"/>
-        </w:rPr>
-        <w:t xml:space="preserve">1. </w:t>
-      </w:r>
-      <w:proofErr w:type="spellStart"/>
-      <w:r>
-        <w:rPr>
-          <w:b/>
-          <w:sz w:val="28"/>
-          <w:szCs w:val="28"/>
-        </w:rPr>
-        <w:t>Tên</w:t>
-      </w:r>
-      <w:proofErr w:type="spellEnd"/>
-      <w:r>
-        <w:rPr>
-          <w:b/>
-          <w:sz w:val="28"/>
-          <w:szCs w:val="28"/>
-        </w:rPr>
-        <w:t xml:space="preserve"> </w:t>
-      </w:r>
-      <w:proofErr w:type="spellStart"/>
-      <w:r>
-        <w:rPr>
-          <w:b/>
-          <w:sz w:val="28"/>
-          <w:szCs w:val="28"/>
-        </w:rPr>
-        <w:t>dự</w:t>
-      </w:r>
-      <w:proofErr w:type="spellEnd"/>
-      <w:r>
-        <w:rPr>
-          <w:b/>
-          <w:sz w:val="28"/>
-          <w:szCs w:val="28"/>
-        </w:rPr>
-        <w:t xml:space="preserve"> </w:t>
-      </w:r>
-      <w:proofErr w:type="spellStart"/>
-      <w:r>
-        <w:rPr>
-          <w:b/>
-          <w:sz w:val="28"/>
-          <w:szCs w:val="28"/>
-        </w:rPr>
-        <w:t>án</w:t>
-      </w:r>
-      <w:proofErr w:type="spellEnd"/>
-      <w:r>
-        <w:rPr>
-          <w:b/>
-          <w:sz w:val="28"/>
-          <w:szCs w:val="28"/>
-        </w:rPr>
-        <w:t>:</w:t>
-      </w:r>
-      <w:r>
-        <w:rPr>
-          <w:sz w:val="28"/>
-          <w:szCs w:val="28"/>
-        </w:rPr>
-        <w:t xml:space="preserve"> </w:t>
-      </w:r>
-      <w:proofErr w:type="spellStart"/>
-      <w:r>
-        <w:rPr>
-          <w:sz w:val="28"/>
-          <w:szCs w:val="28"/>
-        </w:rPr>
-        <w:t>AgriSen</w:t>
-      </w:r>
-      <w:proofErr w:type="spellEnd"/>
-      <w:r>
-        <w:rPr>
-          <w:sz w:val="28"/>
-          <w:szCs w:val="28"/>
-        </w:rPr>
-        <w:t xml:space="preserve"> - </w:t>
-      </w:r>
-      <w:proofErr w:type="spellStart"/>
-      <w:r>
-        <w:rPr>
-          <w:sz w:val="28"/>
-          <w:szCs w:val="28"/>
-        </w:rPr>
-        <w:t>Chợ</w:t>
-      </w:r>
-      <w:proofErr w:type="spellEnd"/>
-      <w:r>
-        <w:rPr>
-          <w:sz w:val="28"/>
-          <w:szCs w:val="28"/>
-        </w:rPr>
-        <w:t xml:space="preserve"> </w:t>
-      </w:r>
-      <w:proofErr w:type="spellStart"/>
-      <w:r>
-        <w:rPr>
-          <w:sz w:val="28"/>
-          <w:szCs w:val="28"/>
-        </w:rPr>
-        <w:t>Nhà</w:t>
-      </w:r>
-      <w:proofErr w:type="spellEnd"/>
-      <w:r>
-        <w:rPr>
-          <w:sz w:val="28"/>
-          <w:szCs w:val="28"/>
-        </w:rPr>
-        <w:t xml:space="preserve"> </w:t>
-      </w:r>
-      <w:proofErr w:type="spellStart"/>
-      <w:r>
-        <w:rPr>
-          <w:sz w:val="28"/>
-          <w:szCs w:val="28"/>
-        </w:rPr>
-        <w:t>Nông</w:t>
-      </w:r>
-      <w:proofErr w:type="spellEnd"/>
-      <w:r>
-        <w:rPr>
-          <w:sz w:val="28"/>
-          <w:szCs w:val="28"/>
-        </w:rPr>
-        <w:t xml:space="preserve"> - </w:t>
-      </w:r>
-      <w:proofErr w:type="spellStart"/>
-      <w:r>
-        <w:rPr>
-          <w:sz w:val="28"/>
-          <w:szCs w:val="28"/>
-        </w:rPr>
-        <w:t>Ứng</w:t>
-      </w:r>
-      <w:proofErr w:type="spellEnd"/>
-      <w:r>
-        <w:rPr>
-          <w:sz w:val="28"/>
-          <w:szCs w:val="28"/>
-        </w:rPr>
-        <w:t xml:space="preserve"> </w:t>
-      </w:r>
-      <w:proofErr w:type="spellStart"/>
-      <w:r>
-        <w:rPr>
-          <w:sz w:val="28"/>
-          <w:szCs w:val="28"/>
-        </w:rPr>
-        <w:t>dụng</w:t>
-      </w:r>
-      <w:proofErr w:type="spellEnd"/>
-      <w:r>
-        <w:rPr>
-          <w:sz w:val="28"/>
-          <w:szCs w:val="28"/>
-        </w:rPr>
-        <w:t xml:space="preserve"> AI </w:t>
-      </w:r>
-      <w:proofErr w:type="spellStart"/>
-      <w:r>
-        <w:rPr>
-          <w:sz w:val="28"/>
-          <w:szCs w:val="28"/>
-        </w:rPr>
-        <w:t>định</w:t>
-      </w:r>
-      <w:proofErr w:type="spellEnd"/>
-      <w:r>
-        <w:rPr>
-          <w:sz w:val="28"/>
-          <w:szCs w:val="28"/>
-        </w:rPr>
-        <w:t xml:space="preserve"> </w:t>
-      </w:r>
-      <w:proofErr w:type="spellStart"/>
-      <w:r>
-        <w:rPr>
-          <w:sz w:val="28"/>
-          <w:szCs w:val="28"/>
-        </w:rPr>
-        <w:t>giá</w:t>
-      </w:r>
-      <w:proofErr w:type="spellEnd"/>
-      <w:r>
-        <w:rPr>
-          <w:sz w:val="28"/>
-          <w:szCs w:val="28"/>
-        </w:rPr>
-        <w:t xml:space="preserve"> </w:t>
-      </w:r>
-      <w:proofErr w:type="spellStart"/>
-      <w:r>
-        <w:rPr>
-          <w:sz w:val="28"/>
-          <w:szCs w:val="28"/>
-        </w:rPr>
-        <w:t>và</w:t>
-      </w:r>
-      <w:proofErr w:type="spellEnd"/>
-      <w:r>
-        <w:rPr>
-          <w:sz w:val="28"/>
-          <w:szCs w:val="28"/>
-        </w:rPr>
-        <w:t xml:space="preserve"> </w:t>
-      </w:r>
-      <w:proofErr w:type="spellStart"/>
-      <w:r>
-        <w:rPr>
-          <w:sz w:val="28"/>
-          <w:szCs w:val="28"/>
-        </w:rPr>
-        <w:t>minh</w:t>
-      </w:r>
-      <w:proofErr w:type="spellEnd"/>
-      <w:r>
-        <w:rPr>
-          <w:sz w:val="28"/>
-          <w:szCs w:val="28"/>
-        </w:rPr>
-        <w:t xml:space="preserve"> </w:t>
-      </w:r>
-      <w:proofErr w:type="spellStart"/>
-      <w:r>
-        <w:rPr>
-          <w:sz w:val="28"/>
-          <w:szCs w:val="28"/>
-        </w:rPr>
-        <w:t>bạch</w:t>
-      </w:r>
-      <w:proofErr w:type="spellEnd"/>
-      <w:r>
-        <w:rPr>
-          <w:sz w:val="28"/>
-          <w:szCs w:val="28"/>
-        </w:rPr>
-        <w:t xml:space="preserve"> </w:t>
-      </w:r>
-      <w:proofErr w:type="spellStart"/>
-      <w:r>
-        <w:rPr>
-          <w:sz w:val="28"/>
-          <w:szCs w:val="28"/>
-        </w:rPr>
-        <w:t>nông</w:t>
-      </w:r>
-      <w:proofErr w:type="spellEnd"/>
-      <w:r>
-        <w:rPr>
-          <w:sz w:val="28"/>
-          <w:szCs w:val="28"/>
-        </w:rPr>
-        <w:t xml:space="preserve"> </w:t>
-      </w:r>
-      <w:proofErr w:type="spellStart"/>
-      <w:r>
-        <w:rPr>
-          <w:sz w:val="28"/>
-          <w:szCs w:val="28"/>
-        </w:rPr>
-        <w:t>sản</w:t>
-      </w:r>
-      <w:proofErr w:type="spellEnd"/>
+      <w:r>
+        <w:rPr>
+          <w:sz w:val="28"/>
+          <w:szCs w:val="28"/>
+        </w:rPr>
+        <w:t>AgriSen - Chợ Nhà Nông - Ứng dụng AI định giá và minh bạch nông sản</w:t>
+      </w:r>
       <w:r>
         <w:rPr>
           <w:sz w:val="28"/>
@@ -4127,6 +2806,7 @@
         <w:rPr>
           <w:noProof/>
         </w:rPr>
+        <w:lastRenderedPageBreak/>
         <w:drawing>
           <wp:anchor distT="0" distB="0" distL="114300" distR="114300" simplePos="0" relativeHeight="251660288" behindDoc="1" locked="0" layoutInCell="1" allowOverlap="1" wp14:anchorId="4F604A60" wp14:editId="4B2807E3">
             <wp:simplePos x="0" y="0"/>
@@ -4196,61 +2876,7 @@
           <w:sz w:val="28"/>
           <w:szCs w:val="28"/>
         </w:rPr>
-        <w:t xml:space="preserve">- </w:t>
-      </w:r>
-      <w:proofErr w:type="spellStart"/>
-      <w:r>
-        <w:rPr>
-          <w:spacing w:val="4"/>
-          <w:sz w:val="28"/>
-          <w:szCs w:val="28"/>
-        </w:rPr>
-        <w:t>Tôi</w:t>
-      </w:r>
-      <w:proofErr w:type="spellEnd"/>
-      <w:r>
-        <w:rPr>
-          <w:spacing w:val="4"/>
-          <w:sz w:val="28"/>
-          <w:szCs w:val="28"/>
-        </w:rPr>
-        <w:t xml:space="preserve"> </w:t>
-      </w:r>
-      <w:proofErr w:type="spellStart"/>
-      <w:r>
-        <w:rPr>
-          <w:spacing w:val="4"/>
-          <w:sz w:val="28"/>
-          <w:szCs w:val="28"/>
-        </w:rPr>
-        <w:t>đồng</w:t>
-      </w:r>
-      <w:proofErr w:type="spellEnd"/>
-      <w:r>
-        <w:rPr>
-          <w:spacing w:val="4"/>
-          <w:sz w:val="28"/>
-          <w:szCs w:val="28"/>
-        </w:rPr>
-        <w:t xml:space="preserve"> ý </w:t>
-      </w:r>
-      <w:proofErr w:type="spellStart"/>
-      <w:r>
-        <w:rPr>
-          <w:spacing w:val="4"/>
-          <w:sz w:val="28"/>
-          <w:szCs w:val="28"/>
-        </w:rPr>
-        <w:t>cho</w:t>
-      </w:r>
-      <w:proofErr w:type="spellEnd"/>
-      <w:r>
-        <w:rPr>
-          <w:spacing w:val="4"/>
-          <w:sz w:val="28"/>
-          <w:szCs w:val="28"/>
-        </w:rPr>
-        <w:t xml:space="preserve"> Ban Tổ chức công bố </w:t>
+        <w:t xml:space="preserve">- Tôi đồng ý cho Ban Tổ chức công bố </w:t>
       </w:r>
       <w:r>
         <w:rPr>
@@ -4321,7 +2947,6 @@
           <w:szCs w:val="28"/>
         </w:rPr>
       </w:pPr>
-      <w:proofErr w:type="spellStart"/>
       <w:r>
         <w:rPr>
           <w:i/>
@@ -4330,7 +2955,6 @@
         </w:rPr>
         <w:t>Ngày</w:t>
       </w:r>
-      <w:proofErr w:type="spellEnd"/>
       <w:r>
         <w:rPr>
           <w:i/>
@@ -4347,23 +2971,21 @@
         </w:rPr>
         <w:t xml:space="preserve">9 </w:t>
       </w:r>
-      <w:proofErr w:type="spellStart"/>
       <w:r>
         <w:rPr>
           <w:i/>
           <w:sz w:val="28"/>
           <w:szCs w:val="28"/>
         </w:rPr>
-        <w:t>tháng</w:t>
-      </w:r>
-      <w:proofErr w:type="spellEnd"/>
+        <w:t xml:space="preserve">tháng </w:t>
+      </w:r>
       <w:r>
         <w:rPr>
           <w:i/>
           <w:sz w:val="28"/>
           <w:szCs w:val="28"/>
         </w:rPr>
-        <w:t xml:space="preserve"> </w:t>
+        <w:t xml:space="preserve">7 </w:t>
       </w:r>
       <w:r>
         <w:rPr>
@@ -4371,25 +2993,7 @@
           <w:sz w:val="28"/>
           <w:szCs w:val="28"/>
         </w:rPr>
-        <w:t xml:space="preserve">7 </w:t>
-      </w:r>
-      <w:proofErr w:type="spellStart"/>
-      <w:r>
-        <w:rPr>
-          <w:i/>
-          <w:sz w:val="28"/>
-          <w:szCs w:val="28"/>
-        </w:rPr>
-        <w:t>năm</w:t>
-      </w:r>
-      <w:proofErr w:type="spellEnd"/>
-      <w:r>
-        <w:rPr>
-          <w:i/>
-          <w:sz w:val="28"/>
-          <w:szCs w:val="28"/>
-        </w:rPr>
-        <w:t xml:space="preserve"> </w:t>
+        <w:t xml:space="preserve">năm </w:t>
       </w:r>
       <w:r>
         <w:rPr>
@@ -4472,7 +3076,6 @@
           <w:szCs w:val="28"/>
           <w:lang w:val="vi-VN"/>
         </w:rPr>
-        <w:lastRenderedPageBreak/>
         <w:tab/>
       </w:r>
     </w:p>

</xml_diff>